<commit_message>
more upd docs for ga
</commit_message>
<xml_diff>
--- a/УЧПРАКТИКА_4345_Бабий_Кравцов_Гаврилов.docx
+++ b/УЧПРАКТИКА_4345_Бабий_Кравцов_Гаврилов.docx
@@ -987,13 +987,7 @@
               <w:rPr>
                 <w:rFonts w:cs="Times New Roman"/>
               </w:rPr>
-              <w:t xml:space="preserve">Дано N </w:t>
-            </w:r>
-            <w:r>
-              <w:rPr>
-                <w:rFonts w:cs="Times New Roman"/>
-              </w:rPr>
-              <w:t>матриц A с произвольными размерами (A1: p0 x p1, A2: p1 x p2, … , AN: pN-1 x pN). Необходимо определить порядок перемножения матриц, чтобы минимизировать количество операций умножения для вычисления результирующей матрицы B: p0 x pN</w:t>
+              <w:t>Дано N матриц A с произвольными размерами (A1: p0 x p1, A2: p1 x p2, … , AN: pN-1 x pN). Необходимо определить порядок перемножения матриц, чтобы минимизировать количество операций умножения для вычисления результирующей матрицы B: p0 x pN</w:t>
             </w:r>
           </w:p>
         </w:tc>
@@ -1019,13 +1013,7 @@
               <w:rPr>
                 <w:szCs w:val="28"/>
               </w:rPr>
-              <w:t>Сроки прохождения прак</w:t>
-            </w:r>
-            <w:r>
-              <w:rPr>
-                <w:szCs w:val="28"/>
-              </w:rPr>
-              <w:t>тики: 06.07.2026 – 18.06.2026</w:t>
+              <w:t>Сроки прохождения практики: 06.07.2026 – 18.06.2026</w:t>
             </w:r>
           </w:p>
         </w:tc>
@@ -1310,24 +1298,15 @@
       </w:pPr>
       <w:bookmarkStart w:id="1" w:name="_Toc73173348"/>
       <w:r>
-        <w:t xml:space="preserve">Предметной областью данной практики являются методы </w:t>
-      </w:r>
-      <w:r>
-        <w:t>оптимизации вычислений и эвристические алгоритмы поиска решений. Рассматривается классическая задача минимизации вычислительных затрат, имеющая прикладное значение в различных сферах: от обработки данных до численного моделирования. Особое внимание уделяет</w:t>
-      </w:r>
-      <w:r>
-        <w:t>ся генетическим алгоритмам как инструменту решения дискретных оптимизационных задач, где пространство возможных решений велико, а применение точных методов затруднено или нецелесообразно.</w:t>
-      </w:r>
-    </w:p>
-    <w:p>
-      <w:pPr>
-        <w:pStyle w:val="a1"/>
-      </w:pPr>
-      <w:r>
-        <w:t>Цель практики — закрепление навыков проектирования и реализации прог</w:t>
-      </w:r>
-      <w:r>
-        <w:t>раммных систем с графическим интерфейсом, а также освоение принципов работы эволюционных алгоритмов через их практическое применение к задаче поиска оптимальной структуры вычислений.</w:t>
+        <w:t>Предметной областью данной практики являются методы оптимизации вычислений и эвристические алгоритмы поиска решений. Рассматривается классическая задача минимизации вычислительных затрат, имеющая прикладное значение в различных сферах: от обработки данных до численного моделирования. Особое внимание уделяется генетическим алгоритмам как инструменту решения дискретных оптимизационных задач, где пространство возможных решений велико, а применение точных методов затруднено или нецелесообразно.</w:t>
+      </w:r>
+    </w:p>
+    <w:p>
+      <w:pPr>
+        <w:pStyle w:val="a1"/>
+      </w:pPr>
+      <w:r>
+        <w:t>Цель практики — закрепление навыков проектирования и реализации программных систем с графическим интерфейсом, а также освоение принципов работы эволюционных алгоритмов через их практическое применение к задаче поиска оптимальной структуры вычислений.</w:t>
       </w:r>
     </w:p>
     <w:p>
@@ -1340,13 +1319,7 @@
         </w:rPr>
       </w:pPr>
       <w:r>
-        <w:t>Задачи практики включают изучение теоретического материала, самостоятельн</w:t>
-      </w:r>
-      <w:r>
-        <w:t xml:space="preserve">ую реализацию алгоритмического ядра и визуализации, организацию пользовательского интерфейса для управления ходом вычислений, а также обеспечение возможности анализа и сравнения получаемых результатов. Отдельное внимание уделяется средствам взаимодействия </w:t>
-      </w:r>
-      <w:r>
-        <w:t>с данными и документированию выполненной работы.</w:t>
+        <w:t>Задачи практики включают изучение теоретического материала, самостоятельную реализацию алгоритмического ядра и визуализации, организацию пользовательского интерфейса для управления ходом вычислений, а также обеспечение возможности анализа и сравнения получаемых результатов. Отдельное внимание уделяется средствам взаимодействия с данными и документированию выполненной работы.</w:t>
       </w:r>
       <w:r>
         <w:br w:type="page"/>
@@ -1398,13 +1371,7 @@
       </w:pPr>
       <w:bookmarkStart w:id="5" w:name="_Toc230206147"/>
       <w:r>
-        <w:t xml:space="preserve">Задача о порядке перемножения матриц актуальна для областей, требующих высокопроизводительных вычислений: машинное обучение, компьютерная графика, САПР, </w:t>
-      </w:r>
-      <w:r>
-        <w:t>оптимизация запросов в базах данных. Различные варианты расстановки скобок дают одинаковый результат, но количество скалярных операций может отличаться на порядки. Классический метод решения — динамическое программирование. Использование генетического алго</w:t>
-      </w:r>
-      <w:r>
-        <w:t>ритма в данной работе позволяет исследовать поведение эвристических методов на дискретных оптимизационных задачах, визуализировать процесс эволюции популяции решений и получить навыки реализации алгоритмов без готовых библиотек.</w:t>
+        <w:t>Задача о порядке перемножения матриц актуальна для областей, требующих высокопроизводительных вычислений: машинное обучение, компьютерная графика, САПР, оптимизация запросов в базах данных. Различные варианты расстановки скобок дают одинаковый результат, но количество скалярных операций может отличаться на порядки. Классический метод решения — динамическое программирование. Использование генетического алгоритма в данной работе позволяет исследовать поведение эвристических методов на дискретных оптимизационных задачах, визуализировать процесс эволюции популяции решений и получить навыки реализации алгоритмов без готовых библиотек.</w:t>
       </w:r>
     </w:p>
     <w:p>
@@ -1430,10 +1397,7 @@
         <w:ind w:left="0" w:firstLine="709"/>
       </w:pPr>
       <w:r>
-        <w:t>Изучить</w:t>
-      </w:r>
-      <w:r>
-        <w:t xml:space="preserve"> математическую постановку задачи перемножения матриц и принципы работы генетических алгоритмов.</w:t>
+        <w:t>Изучить математическую постановку задачи перемножения матриц и принципы работы генетических алгоритмов.</w:t>
       </w:r>
     </w:p>
     <w:p>
@@ -1459,10 +1423,7 @@
         <w:ind w:left="0" w:firstLine="709"/>
       </w:pPr>
       <w:r>
-        <w:t>Реализовать вычислительное ядро (функция качества, кодирование решений, операторы селек</w:t>
-      </w:r>
-      <w:r>
-        <w:t>ции, кроссовера и мутации) без использования готовых библиотек ГА.</w:t>
+        <w:t>Реализовать вычислительное ядро (функция качества, кодирование решений, операторы селекции, кроссовера и мутации) без использования готовых библиотек ГА.</w:t>
       </w:r>
     </w:p>
     <w:p>
@@ -1501,10 +1462,7 @@
         <w:ind w:left="0" w:firstLine="709"/>
       </w:pPr>
       <w:r>
-        <w:t>Реализовать пошаговую визуализацию: те</w:t>
-      </w:r>
-      <w:r>
-        <w:t>кущая аппроксимация, лучшее решение, график функции качества от поколения.</w:t>
+        <w:t>Реализовать пошаговую визуализацию: текущая аппроксимация, лучшее решение, график функции качества от поколения.</w:t>
       </w:r>
     </w:p>
     <w:p>
@@ -1530,10 +1488,7 @@
         <w:ind w:left="0" w:firstLine="709"/>
       </w:pPr>
       <w:r>
-        <w:t>Реализовать откат на несколько шагов назад</w:t>
-      </w:r>
-      <w:r>
-        <w:t>.</w:t>
+        <w:t>Реализовать откат на несколько шагов назад.</w:t>
       </w:r>
     </w:p>
     <w:p>
@@ -1546,10 +1501,7 @@
         <w:ind w:left="0" w:firstLine="709"/>
       </w:pPr>
       <w:r>
-        <w:t>Провести тестирование, сравнение с точным решением, п</w:t>
-      </w:r>
-      <w:r>
-        <w:t>одготовить отчёт.</w:t>
+        <w:t>Провести тестирование, сравнение с точным решением, подготовить отчёт.</w:t>
       </w:r>
       <w:bookmarkEnd w:id="4"/>
       <w:r>
@@ -1596,10 +1548,7 @@
         <w:t>как</w:t>
       </w:r>
       <w:r>
-        <w:t xml:space="preserve"> было сделано для выполнения поставленных</w:t>
-      </w:r>
-      <w:r>
-        <w:t xml:space="preserve"> задач.</w:t>
+        <w:t xml:space="preserve"> было сделано для выполнения поставленных задач.</w:t>
       </w:r>
     </w:p>
     <w:p>
@@ -1655,10 +1604,7 @@
       </w:pPr>
       <w:bookmarkStart w:id="9" w:name="_Toc230206152"/>
       <w:r>
-        <w:t>Генетический алгоритм решает задачу минимизации числа ск</w:t>
-      </w:r>
-      <w:r>
-        <w:t>алярных умножений при перемножении цепочки матриц. Решение (особь) кодируется как список целых чисел — на каждом шаге умножения ген указывает индекс матрицы в текущем списке размерностей, которая будет перемножена со следующей. Длина хромосомы равна </w:t>
+        <w:t>Генетический алгоритм решает задачу минимизации числа скалярных умножений при перемножении цепочки матриц. Решение (особь) кодируется как список целых чисел — на каждом шаге умножения ген указывает индекс матрицы в текущем списке размерностей, которая будет перемножена со следующей. Длина хромосомы равна </w:t>
       </w:r>
       <w:r>
         <w:rPr>
@@ -1702,13 +1648,7 @@
         <w:pStyle w:val="a1"/>
       </w:pPr>
       <w:r>
-        <w:t>Массив чисел, по которому проходя от начала и до конца определяе</w:t>
-      </w:r>
-      <w:r>
-        <w:t>тся</w:t>
-      </w:r>
-      <w:r>
-        <w:t xml:space="preserve"> какие матрицы перемножаются в текущем списке размерностей матриц.</w:t>
+        <w:t>Решение (особь) кодируется последовательностью целых чисел длиной N−2. Каждый ген определяет индекс матрицы в текущем списке размерностей, которая будет перемножена со следующей матрицей. После выполнения умножения список размерностей обновляется, поэтому одинаковое значение гена на разных этапах может соответствовать различным матрицам. Такая кодировка гарантирует корректность любого случайно сгенерированного решения и не требует дополнительной проверки допустимости.</w:t>
       </w:r>
     </w:p>
     <w:p>
@@ -1730,7 +1670,10 @@
         <w:t>хромосомами</w:t>
       </w:r>
       <w:r>
-        <w:t xml:space="preserve"> индивида. Чем меньше - тем лучше. Ограниченна снизу.</w:t>
+        <w:t xml:space="preserve"> индивида. Чем меньше - тем лучше</w:t>
+      </w:r>
+      <w:r>
+        <w:t>.</w:t>
       </w:r>
     </w:p>
     <w:p>
@@ -1746,6 +1689,7 @@
         <w:pStyle w:val="a1"/>
       </w:pPr>
       <w:r>
+        <w:lastRenderedPageBreak/>
         <w:t xml:space="preserve">Если </w:t>
       </w:r>
       <w:r>
@@ -1797,7 +1741,7 @@
         <w:t>)</w:t>
       </w:r>
       <w:r>
-        <w:t xml:space="preserve"> полученное с помощью полного перебора за </w:t>
+        <w:t xml:space="preserve"> полученное за </w:t>
       </w:r>
       <w:r>
         <w:rPr>
@@ -1860,11 +1804,7 @@
         <w:t xml:space="preserve">300000 </w:t>
       </w:r>
       <w:r>
-        <w:t xml:space="preserve">операций алгоритма с популяцией в 100 особей и </w:t>
-      </w:r>
-      <w:r>
-        <w:lastRenderedPageBreak/>
-        <w:t xml:space="preserve">100 поколениями, для меньших </w:t>
+        <w:t xml:space="preserve">операций алгоритма с популяцией в 100 особей и 100 поколениями, для меньших </w:t>
       </w:r>
       <w:r>
         <w:rPr>
@@ -1876,223 +1816,98 @@
         <w:t xml:space="preserve"> - аналогично. Поэтому оценка оправдана.</w:t>
       </w:r>
       <w:r>
-        <w:t xml:space="preserve"> Возможно такое, что алгоритм не сойдется к верному решению, но результат будет приближен к верному</w:t>
-      </w:r>
-      <w:r>
         <w:t xml:space="preserve"> </w:t>
       </w:r>
-      <m:oMath>
-        <m:r>
-          <w:rPr>
-            <w:rFonts w:ascii="Cambria Math" w:hAnsi="Cambria Math"/>
-          </w:rPr>
-          <m:t xml:space="preserve">≈ </m:t>
-        </m:r>
-      </m:oMath>
-      <w:r>
-        <w:t>0.9*</w:t>
+      <w:r>
+        <w:t>На практике генетический алгоритм может не достигнуть глобального оптимума, однако в большинстве проведённых экспериментов получаемое решение отличалось от оптимального не более чем на 10</w:t>
+      </w:r>
+      <w:r>
+        <w:t>-20</w:t>
+      </w:r>
+      <w:r>
+        <w:t>%</w:t>
+      </w:r>
+      <w:r>
+        <w:t>.</w:t>
+      </w:r>
+    </w:p>
+    <w:p>
+      <w:pPr>
+        <w:pStyle w:val="a1"/>
+        <w:rPr>
+          <w:i/>
+        </w:rPr>
+      </w:pPr>
+      <w:r>
+        <w:t>Далее</w:t>
+      </w:r>
+      <w:r>
+        <w:t>,</w:t>
+      </w:r>
+      <w:r>
+        <w:t xml:space="preserve"> при росте </w:t>
       </w:r>
       <w:r>
         <w:rPr>
           <w:lang w:val="en-US"/>
         </w:rPr>
-        <w:t>min</w:t>
-      </w:r>
-      <w:r>
-        <w:t>_</w:t>
+        <w:t>N</w:t>
+      </w:r>
+      <w:r>
+        <w:t>,</w:t>
+      </w:r>
+      <w:r>
+        <w:t xml:space="preserve"> </w:t>
+      </w:r>
+      <w:r>
+        <w:t xml:space="preserve">из-за сложности </w:t>
       </w:r>
       <w:r>
         <w:rPr>
           <w:lang w:val="en-US"/>
         </w:rPr>
-        <w:t>cost</w:t>
-      </w:r>
-      <w:r>
-        <w:t>, разница в 10 процентов при таком количестве операций незначительна.</w:t>
-      </w:r>
-    </w:p>
-    <w:p>
-      <w:pPr>
-        <w:pStyle w:val="a1"/>
-        <w:rPr>
-          <w:i/>
-        </w:rPr>
-      </w:pPr>
-      <w:r>
-        <w:t>Далее</w:t>
+        <w:t>O</w:t>
+      </w:r>
+      <w:r>
+        <w:t>(</w:t>
+      </w:r>
+      <w:r>
+        <w:rPr>
+          <w:lang w:val="en-US"/>
+        </w:rPr>
+        <w:t>N</w:t>
+      </w:r>
+      <w:r>
+        <w:t xml:space="preserve">^3) </w:t>
+      </w:r>
+      <w:r>
+        <w:t>количество операций</w:t>
       </w:r>
       <w:r>
         <w:t>,</w:t>
       </w:r>
       <w:r>
-        <w:t xml:space="preserve"> при росте </w:t>
+        <w:t xml:space="preserve"> потраченное на расчет перебором будет стремительно расти, быстрее чем количество операций алгоритма. Поэтому:</w:t>
+      </w:r>
+    </w:p>
+    <w:p>
+      <w:pPr>
+        <w:pStyle w:val="a1"/>
+      </w:pPr>
+      <w:r>
+        <w:t>Для N&gt;30 точное решение вычислять нецелесообразно. В качестве верхней оценки используется результат жадного алгоритма со сложностью O(n</w:t>
       </w:r>
       <w:r>
         <w:rPr>
           <w:lang w:val="en-US"/>
         </w:rPr>
-        <w:t>N</w:t>
-      </w:r>
-      <w:r>
-        <w:t>,</w:t>
-      </w:r>
-      <w:r>
-        <w:t xml:space="preserve"> </w:t>
-      </w:r>
-      <w:r>
-        <w:t xml:space="preserve">из-за сложности </w:t>
-      </w:r>
-      <w:r>
-        <w:rPr>
-          <w:lang w:val="en-US"/>
-        </w:rPr>
-        <w:t>O</w:t>
-      </w:r>
-      <w:r>
-        <w:t>(</w:t>
-      </w:r>
-      <w:r>
-        <w:rPr>
-          <w:lang w:val="en-US"/>
-        </w:rPr>
-        <w:t>N</w:t>
-      </w:r>
-      <w:r>
-        <w:t xml:space="preserve">^3) </w:t>
-      </w:r>
-      <w:r>
-        <w:t>количество операций</w:t>
-      </w:r>
-      <w:r>
-        <w:t>,</w:t>
-      </w:r>
-      <w:r>
-        <w:t xml:space="preserve"> потраченное на расчет перебором будет стремительно расти, быстрее чем количество операций алгоритма. Поэтому:</w:t>
-      </w:r>
-    </w:p>
-    <w:p>
-      <w:pPr>
-        <w:pStyle w:val="a1"/>
-      </w:pPr>
-      <w:r>
-        <w:t xml:space="preserve">Если </w:t>
-      </w:r>
-      <w:r>
-        <w:rPr>
-          <w:lang w:val="en-US"/>
-        </w:rPr>
-        <w:t>N</w:t>
-      </w:r>
-      <w:r>
-        <w:t xml:space="preserve"> </w:t>
-      </w:r>
-      <w:r>
-        <w:t>&gt; 30</w:t>
-      </w:r>
-      <w:r>
-        <w:t>, то верхней оценкой</w:t>
-      </w:r>
-      <w:r>
-        <w:t xml:space="preserve"> </w:t>
-      </w:r>
-      <w:r>
-        <w:t>(</w:t>
-      </w:r>
-      <w:r>
-        <w:rPr>
-          <w:lang w:val="en-US"/>
-        </w:rPr>
-        <w:t>UL</w:t>
-      </w:r>
-      <w:r>
-        <w:t>)</w:t>
-      </w:r>
-      <w:r>
-        <w:t xml:space="preserve"> будет значение полученное с помощью жадного алгоритма, который на каждой итерации перемножает 2 матрицы с минимальным количеством операций, сложность</w:t>
-      </w:r>
-      <w:r>
-        <w:t xml:space="preserve"> </w:t>
-      </w:r>
-      <w:r>
-        <w:t>–</w:t>
-      </w:r>
-      <w:r>
-        <w:t xml:space="preserve"> </w:t>
-      </w:r>
-      <w:r>
-        <w:rPr>
-          <w:lang w:val="en-US"/>
-        </w:rPr>
-        <w:t>O</w:t>
-      </w:r>
-      <w:r>
-        <w:t>(</w:t>
-      </w:r>
-      <w:r>
-        <w:rPr>
-          <w:lang w:val="en-US"/>
-        </w:rPr>
-        <w:t>n</w:t>
-      </w:r>
-      <w:r>
-        <w:t>^2).</w:t>
-      </w:r>
-      <w:r>
-        <w:t xml:space="preserve"> </w:t>
-      </w:r>
-      <w:r>
-        <w:t xml:space="preserve">Если лучшее значение популяции </w:t>
-      </w:r>
-      <w:r>
-        <w:t xml:space="preserve">&gt;= </w:t>
-      </w:r>
-      <w:r>
-        <w:rPr>
-          <w:lang w:val="en-US"/>
-        </w:rPr>
-        <w:t>c</w:t>
-      </w:r>
-      <w:r>
-        <w:t>*</w:t>
-      </w:r>
-      <w:r>
-        <w:rPr>
-          <w:lang w:val="en-US"/>
-        </w:rPr>
-        <w:t>UL</w:t>
-      </w:r>
-      <w:r>
-        <w:t xml:space="preserve">, </w:t>
-      </w:r>
-      <w:r>
-        <w:t xml:space="preserve">где </w:t>
-      </w:r>
-      <w:r>
-        <w:rPr>
-          <w:lang w:val="en-US"/>
-        </w:rPr>
-        <w:t>c</w:t>
-      </w:r>
-      <w:r>
-        <w:t xml:space="preserve"> – </w:t>
-      </w:r>
-      <w:r>
-        <w:t xml:space="preserve">вещественное число </w:t>
-      </w:r>
-      <w:r>
-        <w:t>&gt; 1</w:t>
-      </w:r>
-      <w:r>
-        <w:t>, то</w:t>
-      </w:r>
-      <w:r>
-        <w:t xml:space="preserve"> решение оптимально</w:t>
+        <w:t>^</w:t>
+      </w:r>
+      <w:r>
+        <w:t>2). Полученное генетическим алгоритмом решение сравнивается с этой оценкой. Если стоимость решения меньше стоимости, полученной жадным алгоритмом, то генетический алгоритм показал более качественный результат. Отношение стоимости решения генетического алгоритма к верхней оценке используется как показатель качества полученного решения.</w:t>
       </w:r>
       <w:r>
         <w:t>.</w:t>
-      </w:r>
-      <w:r>
-        <w:t xml:space="preserve"> Чем больше с, тем оптимальнее решение.</w:t>
       </w:r>
     </w:p>
     <w:p>
@@ -2113,10 +1928,7 @@
         <w:ind w:left="709" w:firstLine="0"/>
       </w:pPr>
       <w:r>
-        <w:t>generate_individual — создаёт случайную особь, где каждый ген gi лежит в диапазоне [0</w:t>
-      </w:r>
-      <w:r>
-        <w:t>,  len−3−i].</w:t>
+        <w:t>generate_individual — создаёт случайную особь, где каждый ген gi лежит в диапазоне [0,  len−3−i].</w:t>
       </w:r>
     </w:p>
     <w:p>
@@ -2160,13 +1972,7 @@
         <w:ind w:left="709" w:firstLine="0"/>
       </w:pPr>
       <w:r>
-        <w:t>calculate_min_cost — э</w:t>
-      </w:r>
-      <w:r>
-        <w:t>талонный метод динамического программирован</w:t>
-      </w:r>
-      <w:r>
-        <w:t>ия для верификации, возвращает глобальный минимум.</w:t>
+        <w:t>calculate_min_cost — эталонный метод динамического программирования для верификации, возвращает глобальный минимум.</w:t>
       </w:r>
     </w:p>
     <w:p>
@@ -2197,10 +2003,11 @@
         <w:t xml:space="preserve"> </w:t>
       </w:r>
       <w:r>
-        <w:t>—</w:t>
-      </w:r>
-      <w:r>
-        <w:t xml:space="preserve"> жадный алгоритм, выбирающий на каждом шаге 2 матрицы с минимальным количеством операций и перемножает, возвращает суммарное количество операций для заданных размерностей.</w:t>
+        <w:t xml:space="preserve">— жадный алгоритм, выбирающий на каждом шаге 2 матрицы с минимальным количеством операций и перемножает, </w:t>
+      </w:r>
+      <w:r>
+        <w:lastRenderedPageBreak/>
+        <w:t>возвращает суммарное количество операций для заданных размерностей.</w:t>
       </w:r>
     </w:p>
     <w:p>
@@ -2226,10 +2033,7 @@
         <w:ind w:left="709" w:firstLine="0"/>
       </w:pPr>
       <w:r>
-        <w:t xml:space="preserve">crossover — одноточечное скрещивание, порождающее двух детей; корректность потомков </w:t>
-      </w:r>
-      <w:r>
-        <w:t>обеспечивается одинаковой структурой допустимых значений генов на соответствующих позициях.</w:t>
+        <w:t>crossover — одноточечное скрещивание, порождающее двух детей; корректность потомков обеспечивается одинаковой структурой допустимых значений генов на соответствующих позициях.</w:t>
       </w:r>
     </w:p>
     <w:p>
@@ -2242,7 +2046,6 @@
         <w:ind w:left="709" w:firstLine="0"/>
       </w:pPr>
       <w:r>
-        <w:lastRenderedPageBreak/>
         <w:t>mutate — независимая мутация каждого гена с вероятностью pm​, заменяющая ген на случайное допустимое значение.</w:t>
       </w:r>
     </w:p>
@@ -2256,10 +2059,7 @@
         <w:ind w:left="709" w:firstLine="0"/>
       </w:pPr>
       <w:r>
-        <w:t>selection — формирует новое поколение: попарно отбира</w:t>
-      </w:r>
-      <w:r>
-        <w:t>ет родителей, с вероятностью pc​ скрещивает, применяет мутацию.</w:t>
+        <w:t>selection — формирует новое поколение: попарно отбирает родителей, с вероятностью pc​ скрещивает, применяет мутацию.</w:t>
       </w:r>
     </w:p>
     <w:p>
@@ -2272,10 +2072,7 @@
         <w:ind w:left="709" w:firstLine="0"/>
       </w:pPr>
       <w:r>
-        <w:t>genetic_algorithm — управляющая функция, принимает параметры (размер популяции, число поколений, вероятности операторов, начальную популяцию и размерности) и возвращает историю поколений в вид</w:t>
-      </w:r>
-      <w:r>
-        <w:t>е списка GenerationSnapshot вместе с глобальным минимумом.</w:t>
+        <w:t>genetic_algorithm — управляющая функция, принимает параметры (размер популяции, число поколений, вероятности операторов, начальную популяцию и размерности) и возвращает историю поколений в виде списка GenerationSnapshot вместе с глобальным минимумом.</w:t>
       </w:r>
     </w:p>
     <w:p>
@@ -2288,10 +2085,7 @@
         <w:ind w:left="709" w:firstLine="0"/>
       </w:pPr>
       <w:r>
-        <w:t>Датакласс GenerationSnapshot фиксирует состояние популяции на каждом поколении: номер поколения, лучшую и среднюю стоимость, хромосому лучшего решения и полную популяцию (глубокая копия). Эти данны</w:t>
-      </w:r>
-      <w:r>
-        <w:t>е являются связующим звеном между вычислительным ядром и графическим интерфейсом.</w:t>
+        <w:t>Датакласс GenerationSnapshot фиксирует состояние популяции на каждом поколении: номер поколения, лучшую и среднюю стоимость, хромосому лучшего решения и полную популяцию (глубокая копия). Эти данные являются связующим звеном между вычислительным ядром и графическим интерфейсом.</w:t>
       </w:r>
     </w:p>
     <w:p>
@@ -2307,10 +2101,7 @@
         <w:pStyle w:val="a1"/>
       </w:pPr>
       <w:r>
-        <w:t>Интерфейс получает от пользователя два вида входных параметров: 1) размерности матриц заданные вручную(вида rows x cols), 2) путь к файлу, содержащие размерности,</w:t>
-      </w:r>
-      <w:r>
-        <w:t xml:space="preserve"> 3) Количество случайно заданных матриц. После ввода данные передаются в genetic_algorithm. Результатом вызова является список снимков поколений.</w:t>
+        <w:t>Интерфейс получает от пользователя два вида входных параметров: 1) размерности матриц заданные вручную(вида rows x cols), 2) путь к файлу, содержащие размерности, 3) Количество случайно заданных матриц. После ввода данные передаются в genetic_algorithm. Результатом вызова является список снимков поколений.</w:t>
       </w:r>
     </w:p>
     <w:p>
@@ -2344,6 +2135,7 @@
         <w:ind w:left="709" w:firstLine="0"/>
       </w:pPr>
       <w:r>
+        <w:lastRenderedPageBreak/>
         <w:t>построения графика изменения лучшей и средней стоимости от поколения;</w:t>
       </w:r>
     </w:p>
@@ -2365,14 +2157,7 @@
         <w:pStyle w:val="a1"/>
       </w:pPr>
       <w:r>
-        <w:t>Возможность отката на несколько шагов реализуется за с</w:t>
-      </w:r>
-      <w:r>
-        <w:t xml:space="preserve">чёт сохранения полной популяции в каждом снимке и вызова genetic_algorithm с параметром population, равным сохранённой популяции требуемого </w:t>
-      </w:r>
-      <w:r>
-        <w:lastRenderedPageBreak/>
-        <w:t>поколения. Это позволяет продолжить эволюцию с любой предыдущей точки без пересчёта всей истории.</w:t>
+        <w:t>Возможность отката на несколько шагов реализуется за счёт сохранения полной популяции в каждом снимке и вызова genetic_algorithm с параметром population, равным сохранённой популяции требуемого поколения. Это позволяет продолжить эволюцию с любой предыдущей точки без пересчёта всей истории.</w:t>
       </w:r>
     </w:p>
     <w:p>
@@ -2384,13 +2169,7 @@
         </w:numPr>
       </w:pPr>
       <w:r>
-        <w:t>2.</w:t>
-      </w:r>
-      <w:r>
-        <w:t>3</w:t>
-      </w:r>
-      <w:r>
-        <w:t xml:space="preserve">. </w:t>
+        <w:t xml:space="preserve">2.3. </w:t>
       </w:r>
       <w:r>
         <w:rPr>
@@ -2404,16 +2183,7 @@
         <w:pStyle w:val="a1"/>
       </w:pPr>
       <w:r>
-        <w:t>Г</w:t>
-      </w:r>
-      <w:r>
-        <w:t>рафический и</w:t>
-      </w:r>
-      <w:r>
-        <w:t>нтерфейс реализован с использованием библиотеки PySide6. Навигация между экранами осуществляется с помощью контейнера QStackedWidget, а управление переходами выполняется из MainWindow. Каждая страница представляет собой независимый класс-наследник QWidget,</w:t>
-      </w:r>
-      <w:r>
-        <w:t xml:space="preserve"> взаимодействующий с остальной системой посредством механизма сигналов и слотов.</w:t>
+        <w:t>Графический интерфейс реализован с использованием библиотеки PySide6. Навигация между экранами осуществляется с помощью контейнера QStackedWidget, а управление переходами выполняется из MainWindow. Каждая страница представляет собой независимый класс-наследник QWidget, взаимодействующий с остальной системой посредством механизма сигналов и слотов.</w:t>
       </w:r>
     </w:p>
     <w:p>
@@ -2438,10 +2208,7 @@
         </w:numPr>
       </w:pPr>
       <w:r>
-        <w:t>WelcomePage — стартовая страница приложения. Отображает краткое описание назначения программы и предоставляет пользователю возможность перейти</w:t>
-      </w:r>
-      <w:r>
-        <w:t xml:space="preserve"> к следующему этапу или завершить работу приложения.</w:t>
+        <w:t>WelcomePage — стартовая страница приложения. Отображает краткое описание назначения программы и предоставляет пользователю возможность перейти к следующему этапу или завершить работу приложения.</w:t>
       </w:r>
     </w:p>
     <w:p>
@@ -2489,10 +2256,7 @@
         </w:numPr>
       </w:pPr>
       <w:r>
-        <w:t>ручной ввод разме</w:t>
-      </w:r>
-      <w:r>
-        <w:t>ров матриц.</w:t>
+        <w:t>ручной ввод размеров матриц.</w:t>
       </w:r>
     </w:p>
     <w:p>
@@ -2504,10 +2268,11 @@
         </w:numPr>
       </w:pPr>
       <w:r>
-        <w:t>ManualInputPage — страница ручного ввода размерностей матриц. Позволяет последовательно добавлять размеры матриц в цепочку, автоматически проверяя корректность их совместимости.. После ввода как минимум двух совместимых матриц становится доступ</w:t>
-      </w:r>
-      <w:r>
-        <w:t>ен переход к следующему этапу.</w:t>
+        <w:t xml:space="preserve">ManualInputPage — страница ручного ввода размерностей матриц. Позволяет последовательно добавлять размеры матриц в цепочку, </w:t>
+      </w:r>
+      <w:r>
+        <w:lastRenderedPageBreak/>
+        <w:t>автоматически проверяя корректность их совместимости.. После ввода как минимум двух совместимых матриц становится доступен переход к следующему этапу.</w:t>
       </w:r>
     </w:p>
     <w:p>
@@ -2519,14 +2284,7 @@
         </w:numPr>
       </w:pPr>
       <w:r>
-        <w:t xml:space="preserve">GraphPage — страница визуализации результатов работы алгоритма. Использует библиотеку pyqtgraph для построения графика зависимости лучшего значения функции приспособленности от номера поколения </w:t>
-      </w:r>
-      <w:r>
-        <w:lastRenderedPageBreak/>
-        <w:t>Предусмотрена возможность повто</w:t>
-      </w:r>
-      <w:r>
-        <w:t>рного построения графика без возврата к предыдущим этапам.</w:t>
+        <w:t>GraphPage — страница визуализации результатов работы алгоритма. Использует библиотеку pyqtgraph для построения графика зависимости лучшего значения функции приспособленности от номера поколения Предусмотрена возможность повторного построения графика без возврата к предыдущим этапам.</w:t>
       </w:r>
     </w:p>
     <w:p>
@@ -2562,10 +2320,7 @@
         </w:numPr>
       </w:pPr>
       <w:r>
-        <w:t xml:space="preserve">организует их </w:t>
-      </w:r>
-      <w:r>
-        <w:t>размещение в QStackedWidget;</w:t>
+        <w:t>организует их размещение в QStackedWidget;</w:t>
       </w:r>
     </w:p>
     <w:p>
@@ -2601,10 +2356,7 @@
         </w:numPr>
       </w:pPr>
       <w:r>
-        <w:t>загружает данные из файла, генерирует случайные матрицы либо принимает введ</w:t>
-      </w:r>
-      <w:r>
-        <w:t>ённые пользователем размерности;</w:t>
+        <w:t>загружает данные из файла, генерирует случайные матрицы либо принимает введённые пользователем размерности;</w:t>
       </w:r>
     </w:p>
     <w:p>
@@ -2628,10 +2380,7 @@
         </w:numPr>
       </w:pPr>
       <w:r>
-        <w:t>Перечисление Choice — определяет возможные варианты источника входных данных (CHOICE_RANDOM, CHOICE_FILE, CHOICE_MANUAL) и используется для унификации обмена информацией</w:t>
-      </w:r>
-      <w:r>
-        <w:t xml:space="preserve"> между страницами интерфейса и главным окном.</w:t>
+        <w:t>Перечисление Choice — определяет возможные варианты источника входных данных (CHOICE_RANDOM, CHOICE_FILE, CHOICE_MANUAL) и используется для унификации обмена информацией между страницами интерфейса и главным окном.</w:t>
       </w:r>
     </w:p>
     <w:p>
@@ -2680,10 +2429,7 @@
         <w:pStyle w:val="a1"/>
       </w:pPr>
       <w:r>
-        <w:t>Это могут быть языки программирования, списки конкретных библиотек / ПО и целе</w:t>
-      </w:r>
-      <w:r>
-        <w:t>й / мест их применения.</w:t>
+        <w:t>Это могут быть языки программирования, списки конкретных библиотек / ПО и целей / мест их применения.</w:t>
       </w:r>
       <w:r>
         <w:br w:type="page"/>
@@ -2730,10 +2476,7 @@
         <w:pStyle w:val="a1"/>
       </w:pPr>
       <w:r>
-        <w:t>Если прохождение практики было по своей теме, то необходи</w:t>
-      </w:r>
-      <w:r>
-        <w:t>мо добавить скан отзыва руководителя с оценкой и подписью, скан должен быть в высоком качестве на всю страницу.</w:t>
+        <w:t>Если прохождение практики было по своей теме, то необходимо добавить скан отзыва руководителя с оценкой и подписью, скан должен быть в высоком качестве на всю страницу.</w:t>
       </w:r>
     </w:p>
     <w:p>
@@ -2749,10 +2492,7 @@
         <w:pStyle w:val="a1"/>
       </w:pPr>
       <w:r>
-        <w:t>Отзыв руководителя с оценкой</w:t>
-      </w:r>
-      <w:r>
-        <w:t xml:space="preserve"> (см. рис. Х).</w:t>
+        <w:t>Отзыв руководителя с оценкой (см. рис. Х).</w:t>
       </w:r>
     </w:p>
     <w:p>
@@ -2882,13 +2622,7 @@
           <w:rFonts w:cs="Times New Roman"/>
         </w:rPr>
         <w:lastRenderedPageBreak/>
-        <w:t xml:space="preserve">СПИСОК </w:t>
-      </w:r>
-      <w:r>
-        <w:rPr>
-          <w:rFonts w:cs="Times New Roman"/>
-        </w:rPr>
-        <w:t>ИСПОЛЬЗОВАННЫХ ИСТОЧНИКОВ</w:t>
+        <w:t>СПИСОК ИСПОЛЬЗОВАННЫХ ИСТОЧНИКОВ</w:t>
       </w:r>
       <w:bookmarkEnd w:id="13"/>
       <w:r>
@@ -2944,10 +2678,7 @@
         </w:numPr>
       </w:pPr>
       <w:r>
-        <w:t>Бобкова, О.В., Давыдов, С.А., Ковалева, И.А., Плагиат как гражданское правонарушение / О.В. Бобкова, С.А. Давыдов, И</w:t>
-      </w:r>
-      <w:r>
-        <w:t>.А. Ковалева // Патенты и лицензии. – 2016. – № 7. – С. 31-37.</w:t>
+        <w:t>Бобкова, О.В., Давыдов, С.А., Ковалева, И.А., Плагиат как гражданское правонарушение / О.В. Бобкова, С.А. Давыдов, И.А. Ковалева // Патенты и лицензии. – 2016. – № 7. – С. 31-37.</w:t>
       </w:r>
     </w:p>
     <w:p>

</xml_diff>

<commit_message>
fix: added to report about proposed changes
</commit_message>
<xml_diff>
--- a/УЧПРАКТИКА_4345_Бабий_Кравцов_Гаврилов.docx
+++ b/УЧПРАКТИКА_4345_Бабий_Кравцов_Гаврилов.docx
@@ -529,11 +529,11 @@
         <w:tblLook w:noHBand="0" w:noVBand="0" w:firstColumn="0" w:lastRow="0" w:lastColumn="0" w:firstRow="0" w:val="0000"/>
       </w:tblPr>
       <w:tblGrid>
-        <w:gridCol w:w="2632"/>
+        <w:gridCol w:w="2631"/>
         <w:gridCol w:w="1448"/>
-        <w:gridCol w:w="2469"/>
-        <w:gridCol w:w="256"/>
-        <w:gridCol w:w="2550"/>
+        <w:gridCol w:w="2470"/>
+        <w:gridCol w:w="255"/>
+        <w:gridCol w:w="2551"/>
       </w:tblGrid>
       <w:tr>
         <w:trPr>
@@ -541,7 +541,7 @@
         </w:trPr>
         <w:tc>
           <w:tcPr>
-            <w:tcW w:w="2632" w:type="dxa"/>
+            <w:tcW w:w="2631" w:type="dxa"/>
             <w:tcBorders/>
             <w:vAlign w:val="bottom"/>
           </w:tcPr>
@@ -556,19 +556,7 @@
               <w:rPr>
                 <w:rFonts w:cs="Times New Roman"/>
               </w:rPr>
-              <w:t>Студент</w:t>
-            </w:r>
-            <w:r>
-              <w:rPr>
-                <w:rFonts w:cs="Times New Roman"/>
-              </w:rPr>
-              <w:t>ы</w:t>
-            </w:r>
-            <w:r>
-              <w:rPr>
-                <w:rFonts w:cs="Times New Roman"/>
-              </w:rPr>
-              <w:t xml:space="preserve"> гр.4345</w:t>
+              <w:t>Студенты гр.4345</w:t>
             </w:r>
           </w:p>
         </w:tc>
@@ -597,7 +585,7 @@
         </w:tc>
         <w:tc>
           <w:tcPr>
-            <w:tcW w:w="2469" w:type="dxa"/>
+            <w:tcW w:w="2470" w:type="dxa"/>
             <w:tcBorders>
               <w:bottom w:val="single" w:sz="4" w:space="0" w:color="000000"/>
             </w:tcBorders>
@@ -622,7 +610,7 @@
         </w:tc>
         <w:tc>
           <w:tcPr>
-            <w:tcW w:w="256" w:type="dxa"/>
+            <w:tcW w:w="255" w:type="dxa"/>
             <w:tcBorders/>
           </w:tcPr>
           <w:p>
@@ -644,7 +632,7 @@
         </w:tc>
         <w:tc>
           <w:tcPr>
-            <w:tcW w:w="2550" w:type="dxa"/>
+            <w:tcW w:w="2551" w:type="dxa"/>
             <w:tcBorders/>
             <w:vAlign w:val="bottom"/>
           </w:tcPr>
@@ -710,7 +698,7 @@
         </w:trPr>
         <w:tc>
           <w:tcPr>
-            <w:tcW w:w="2632" w:type="dxa"/>
+            <w:tcW w:w="2631" w:type="dxa"/>
             <w:tcBorders/>
             <w:vAlign w:val="bottom"/>
           </w:tcPr>
@@ -758,7 +746,7 @@
         </w:tc>
         <w:tc>
           <w:tcPr>
-            <w:tcW w:w="2469" w:type="dxa"/>
+            <w:tcW w:w="2470" w:type="dxa"/>
             <w:tcBorders>
               <w:top w:val="single" w:sz="4" w:space="0" w:color="000000"/>
             </w:tcBorders>
@@ -782,7 +770,7 @@
         </w:tc>
         <w:tc>
           <w:tcPr>
-            <w:tcW w:w="256" w:type="dxa"/>
+            <w:tcW w:w="255" w:type="dxa"/>
             <w:tcBorders/>
           </w:tcPr>
           <w:p>
@@ -804,7 +792,7 @@
         </w:tc>
         <w:tc>
           <w:tcPr>
-            <w:tcW w:w="2550" w:type="dxa"/>
+            <w:tcW w:w="2551" w:type="dxa"/>
             <w:tcBorders/>
           </w:tcPr>
           <w:p>
@@ -833,7 +821,7 @@
         </w:trPr>
         <w:tc>
           <w:tcPr>
-            <w:tcW w:w="2632" w:type="dxa"/>
+            <w:tcW w:w="2631" w:type="dxa"/>
             <w:tcBorders/>
             <w:vAlign w:val="bottom"/>
           </w:tcPr>
@@ -876,7 +864,7 @@
         </w:tc>
         <w:tc>
           <w:tcPr>
-            <w:tcW w:w="2469" w:type="dxa"/>
+            <w:tcW w:w="2470" w:type="dxa"/>
             <w:tcBorders>
               <w:bottom w:val="single" w:sz="4" w:space="0" w:color="000000"/>
             </w:tcBorders>
@@ -901,7 +889,7 @@
         </w:tc>
         <w:tc>
           <w:tcPr>
-            <w:tcW w:w="256" w:type="dxa"/>
+            <w:tcW w:w="255" w:type="dxa"/>
             <w:tcBorders/>
           </w:tcPr>
           <w:p>
@@ -923,7 +911,7 @@
         </w:tc>
         <w:tc>
           <w:tcPr>
-            <w:tcW w:w="2550" w:type="dxa"/>
+            <w:tcW w:w="2551" w:type="dxa"/>
             <w:tcBorders/>
             <w:vAlign w:val="bottom"/>
           </w:tcPr>
@@ -950,7 +938,7 @@
         </w:trPr>
         <w:tc>
           <w:tcPr>
-            <w:tcW w:w="2632" w:type="dxa"/>
+            <w:tcW w:w="2631" w:type="dxa"/>
             <w:tcBorders/>
             <w:vAlign w:val="bottom"/>
           </w:tcPr>
@@ -997,7 +985,7 @@
         </w:tc>
         <w:tc>
           <w:tcPr>
-            <w:tcW w:w="2469" w:type="dxa"/>
+            <w:tcW w:w="2470" w:type="dxa"/>
             <w:tcBorders>
               <w:top w:val="single" w:sz="4" w:space="0" w:color="000000"/>
             </w:tcBorders>
@@ -1021,7 +1009,7 @@
         </w:tc>
         <w:tc>
           <w:tcPr>
-            <w:tcW w:w="256" w:type="dxa"/>
+            <w:tcW w:w="255" w:type="dxa"/>
             <w:tcBorders/>
           </w:tcPr>
           <w:p>
@@ -1043,7 +1031,7 @@
         </w:tc>
         <w:tc>
           <w:tcPr>
-            <w:tcW w:w="2550" w:type="dxa"/>
+            <w:tcW w:w="2551" w:type="dxa"/>
             <w:tcBorders/>
           </w:tcPr>
           <w:p>
@@ -1183,8 +1171,8 @@
         <w:tblLook w:noHBand="0" w:noVBand="1" w:firstColumn="1" w:lastRow="0" w:lastColumn="0" w:firstRow="1" w:val="04a0"/>
       </w:tblPr>
       <w:tblGrid>
-        <w:gridCol w:w="4045"/>
-        <w:gridCol w:w="2311"/>
+        <w:gridCol w:w="4044"/>
+        <w:gridCol w:w="2312"/>
         <w:gridCol w:w="2998"/>
       </w:tblGrid>
       <w:tr>
@@ -1207,19 +1195,7 @@
               <w:rPr>
                 <w:szCs w:val="28"/>
               </w:rPr>
-              <w:t>Студент</w:t>
-            </w:r>
-            <w:r>
-              <w:rPr>
-                <w:szCs w:val="28"/>
-              </w:rPr>
-              <w:t>ы</w:t>
-            </w:r>
-            <w:r>
-              <w:rPr>
-                <w:szCs w:val="28"/>
-              </w:rPr>
-              <w:t xml:space="preserve">: </w:t>
+              <w:t xml:space="preserve">Студенты: </w:t>
             </w:r>
             <w:r>
               <w:rPr>
@@ -1456,7 +1432,7 @@
         </w:trPr>
         <w:tc>
           <w:tcPr>
-            <w:tcW w:w="4045" w:type="dxa"/>
+            <w:tcW w:w="4044" w:type="dxa"/>
             <w:tcBorders/>
             <w:vAlign w:val="bottom"/>
           </w:tcPr>
@@ -1478,7 +1454,7 @@
         </w:tc>
         <w:tc>
           <w:tcPr>
-            <w:tcW w:w="2311" w:type="dxa"/>
+            <w:tcW w:w="2312" w:type="dxa"/>
             <w:tcBorders>
               <w:bottom w:val="single" w:sz="4" w:space="0" w:color="000000"/>
             </w:tcBorders>
@@ -1569,7 +1545,7 @@
         </w:trPr>
         <w:tc>
           <w:tcPr>
-            <w:tcW w:w="4045" w:type="dxa"/>
+            <w:tcW w:w="4044" w:type="dxa"/>
             <w:tcBorders/>
             <w:vAlign w:val="bottom"/>
           </w:tcPr>
@@ -1590,7 +1566,7 @@
         </w:tc>
         <w:tc>
           <w:tcPr>
-            <w:tcW w:w="2311" w:type="dxa"/>
+            <w:tcW w:w="2312" w:type="dxa"/>
             <w:tcBorders>
               <w:top w:val="single" w:sz="4" w:space="0" w:color="000000"/>
               <w:bottom w:val="single" w:sz="4" w:space="0" w:color="000000"/>
@@ -1655,7 +1631,10 @@
         </w:rPr>
       </w:pPr>
       <w:r>
-        <w:rPr/>
+        <w:rPr>
+          <w:b/>
+          <w:bCs/>
+        </w:rPr>
       </w:r>
       <w:r>
         <w:br w:type="page"/>
@@ -1954,48 +1933,6 @@
     </w:p>
     <w:p>
       <w:pPr>
-        <w:pStyle w:val="BodyText"/>
-        <w:rPr/>
-      </w:pPr>
-      <w:r>
-        <w:rPr/>
-        <w:t xml:space="preserve">Данная глава должна содержать описание процесса решения и результаты по каждой задаче практики из предыдущего раздела. По приведённому тексту читатель должен понять, </w:t>
-      </w:r>
-      <w:r>
-        <w:rPr>
-          <w:i/>
-          <w:iCs/>
-        </w:rPr>
-        <w:t>что</w:t>
-      </w:r>
-      <w:r>
-        <w:rPr/>
-        <w:t xml:space="preserve"> и </w:t>
-      </w:r>
-      <w:r>
-        <w:rPr>
-          <w:i/>
-          <w:iCs/>
-        </w:rPr>
-        <w:t>как</w:t>
-      </w:r>
-      <w:r>
-        <w:rPr/>
-        <w:t xml:space="preserve"> было сделано для выполнения поставленных задач.</w:t>
-      </w:r>
-    </w:p>
-    <w:p>
-      <w:pPr>
-        <w:pStyle w:val="BodyText"/>
-        <w:rPr/>
-      </w:pPr>
-      <w:r>
-        <w:rPr/>
-        <w:t>Повествование ведется обезличенно.</w:t>
-      </w:r>
-    </w:p>
-    <w:p>
-      <w:pPr>
         <w:pStyle w:val="Heading3"/>
         <w:numPr>
           <w:ilvl w:val="2"/>
@@ -2003,21 +1940,1154 @@
         </w:numPr>
         <w:rPr/>
       </w:pPr>
-      <w:bookmarkStart w:id="7" w:name="_Toc230206150"/>
-      <w:r>
-        <w:rPr/>
-        <w:t>2.1. Формулировка задачи 1</w:t>
+      <w:bookmarkStart w:id="7" w:name="_Toc230206151"/>
+      <w:r>
+        <w:rPr/>
+        <w:t>2.</w:t>
+      </w:r>
+      <w:r>
+        <w:rPr/>
+        <w:t>1</w:t>
+      </w:r>
+      <w:r>
+        <w:rPr/>
+        <w:t xml:space="preserve">. </w:t>
       </w:r>
       <w:bookmarkEnd w:id="7"/>
-    </w:p>
-    <w:p>
-      <w:pPr>
-        <w:pStyle w:val="BodyText"/>
-        <w:rPr/>
-      </w:pPr>
-      <w:r>
-        <w:rPr/>
-        <w:t>Описание процесса решения задачи №1, реализованные или использованные классы / модули / сервисы и т.д.</w:t>
+      <w:r>
+        <w:rPr/>
+        <w:t>Генетический алгоритм</w:t>
+      </w:r>
+    </w:p>
+    <w:p>
+      <w:pPr>
+        <w:pStyle w:val="BodyText"/>
+        <w:bidi w:val="0"/>
+        <w:rPr/>
+      </w:pPr>
+      <w:bookmarkStart w:id="8" w:name="_Toc230206152"/>
+      <w:r>
+        <w:rPr/>
+        <w:t xml:space="preserve">Генетический алгоритм решает задачу минимизации числа скалярных умножений при перемножении цепочки матриц. Решение (особь) кодируется как список целых чисел — на каждом шаге умножения ген указывает индекс матрицы в текущем списке размерностей, которая будет перемножена со следующей. Длина хромосомы равна </w:t>
+      </w:r>
+      <w:r>
+        <w:rPr>
+          <w:i/>
+          <w:iCs/>
+        </w:rPr>
+        <w:t>N-2</w:t>
+      </w:r>
+      <w:r>
+        <w:rPr/>
+        <w:t xml:space="preserve">, где </w:t>
+      </w:r>
+      <w:r>
+        <w:rPr>
+          <w:i/>
+          <w:iCs/>
+        </w:rPr>
+        <w:t>N</w:t>
+      </w:r>
+      <w:r>
+        <w:rPr/>
+        <w:t> — количество матриц. Такой способ гарантирует корректность любого случайно сгенерированного решения без дополнительной валидации.</w:t>
+      </w:r>
+    </w:p>
+    <w:p>
+      <w:pPr>
+        <w:pStyle w:val="Heading4"/>
+        <w:rPr/>
+      </w:pPr>
+      <w:r>
+        <w:rPr/>
+        <w:t>Основные компоненты алгоритма:</w:t>
+      </w:r>
+    </w:p>
+    <w:p>
+      <w:pPr>
+        <w:pStyle w:val="BodyText"/>
+        <w:numPr>
+          <w:ilvl w:val="0"/>
+          <w:numId w:val="5"/>
+        </w:numPr>
+        <w:ind w:hanging="0" w:start="709"/>
+        <w:rPr/>
+      </w:pPr>
+      <w:r>
+        <w:rPr/>
+        <w:t>generate_individual — создаёт случайную особь, где каждый ген gi лежит в диапазоне [0,  len−3−i].</w:t>
+      </w:r>
+    </w:p>
+    <w:p>
+      <w:pPr>
+        <w:pStyle w:val="BodyText"/>
+        <w:numPr>
+          <w:ilvl w:val="0"/>
+          <w:numId w:val="5"/>
+        </w:numPr>
+        <w:ind w:hanging="0" w:start="709"/>
+        <w:rPr/>
+      </w:pPr>
+      <w:r>
+        <w:rPr/>
+        <w:t>calculate_cost — вычисляет функцию приспособленности: последовательно перемножает матрицы согласно порядку, заданному хромосомой, и суммирует затраты pa​</w:t>
+      </w:r>
+      <w:r>
+        <w:rPr>
+          <w:rFonts w:cs="Cambria Math" w:ascii="Cambria Math" w:hAnsi="Cambria Math"/>
+        </w:rPr>
+        <w:t>⋅</w:t>
+      </w:r>
+      <w:r>
+        <w:rPr/>
+        <w:t>pb​</w:t>
+      </w:r>
+      <w:r>
+        <w:rPr>
+          <w:rFonts w:cs="Cambria Math" w:ascii="Cambria Math" w:hAnsi="Cambria Math"/>
+        </w:rPr>
+        <w:t>⋅</w:t>
+      </w:r>
+      <w:r>
+        <w:rPr/>
+        <w:t>pc​ на каждом шаге.</w:t>
+      </w:r>
+    </w:p>
+    <w:p>
+      <w:pPr>
+        <w:pStyle w:val="BodyText"/>
+        <w:numPr>
+          <w:ilvl w:val="0"/>
+          <w:numId w:val="5"/>
+        </w:numPr>
+        <w:ind w:hanging="0" w:start="709"/>
+        <w:rPr/>
+      </w:pPr>
+      <w:r>
+        <w:rPr/>
+        <w:t>calculate_min_cost — эталонный метод динамического программирования для верификации, возвращает глобальный минимум.</w:t>
+      </w:r>
+    </w:p>
+    <w:p>
+      <w:pPr>
+        <w:pStyle w:val="BodyText"/>
+        <w:numPr>
+          <w:ilvl w:val="0"/>
+          <w:numId w:val="5"/>
+        </w:numPr>
+        <w:ind w:hanging="0" w:start="709"/>
+        <w:rPr/>
+      </w:pPr>
+      <w:r>
+        <w:rPr/>
+        <w:t>tournament — турнирная селекция: из трёх случайно выбранных особей побеждает особь с наименьшей стоимостью.</w:t>
+      </w:r>
+    </w:p>
+    <w:p>
+      <w:pPr>
+        <w:pStyle w:val="BodyText"/>
+        <w:numPr>
+          <w:ilvl w:val="0"/>
+          <w:numId w:val="5"/>
+        </w:numPr>
+        <w:ind w:hanging="0" w:start="709"/>
+        <w:rPr/>
+      </w:pPr>
+      <w:r>
+        <w:rPr/>
+        <w:t>crossover — одноточечное скрещивание, порождающее двух детей; корректность потомков обеспечивается одинаковой структурой допустимых значений генов на соответствующих позициях.</w:t>
+      </w:r>
+    </w:p>
+    <w:p>
+      <w:pPr>
+        <w:pStyle w:val="BodyText"/>
+        <w:numPr>
+          <w:ilvl w:val="0"/>
+          <w:numId w:val="5"/>
+        </w:numPr>
+        <w:ind w:hanging="0" w:start="709"/>
+        <w:rPr/>
+      </w:pPr>
+      <w:r>
+        <w:rPr/>
+        <w:t>mutate — независимая мутация каждого гена с вероятностью pm​, заменяющая ген на случайное допустимое значение.</w:t>
+      </w:r>
+    </w:p>
+    <w:p>
+      <w:pPr>
+        <w:pStyle w:val="BodyText"/>
+        <w:numPr>
+          <w:ilvl w:val="0"/>
+          <w:numId w:val="5"/>
+        </w:numPr>
+        <w:ind w:hanging="0" w:start="709"/>
+        <w:rPr/>
+      </w:pPr>
+      <w:r>
+        <w:rPr/>
+        <w:t>selection — формирует новое поколение: попарно отбирает родителей, с вероятностью pc​ скрещивает, применяет мутацию.</w:t>
+      </w:r>
+    </w:p>
+    <w:p>
+      <w:pPr>
+        <w:pStyle w:val="BodyText"/>
+        <w:numPr>
+          <w:ilvl w:val="0"/>
+          <w:numId w:val="5"/>
+        </w:numPr>
+        <w:ind w:hanging="0" w:start="709"/>
+        <w:rPr/>
+      </w:pPr>
+      <w:r>
+        <w:rPr/>
+        <w:t>genetic_algorithm — управляющая функция, принимает параметры (размер популяции, число поколений, вероятности операторов, начальную популяцию и размерности) и возвращает историю поколений в виде списка GenerationSnapshot вместе с глобальным минимумом.</w:t>
+      </w:r>
+    </w:p>
+    <w:p>
+      <w:pPr>
+        <w:pStyle w:val="BodyText"/>
+        <w:numPr>
+          <w:ilvl w:val="0"/>
+          <w:numId w:val="5"/>
+        </w:numPr>
+        <w:ind w:hanging="0" w:start="709"/>
+        <w:rPr/>
+      </w:pPr>
+      <w:r>
+        <w:rPr/>
+        <w:t>Датакласс GenerationSnapshot фиксирует состояние популяции на каждом поколении: номер поколения, лучшую и среднюю стоимость, хромосому лучшего решения и полную популяцию (глубокая копия). Эти данные являются связующим звеном между вычислительным ядром и графическим интерфейсом.</w:t>
+      </w:r>
+    </w:p>
+    <w:p>
+      <w:pPr>
+        <w:pStyle w:val="Heading4"/>
+        <w:rPr/>
+      </w:pPr>
+      <w:r>
+        <w:rPr/>
+        <w:t>Связь с GUI</w:t>
+      </w:r>
+    </w:p>
+    <w:p>
+      <w:pPr>
+        <w:pStyle w:val="BodyText"/>
+        <w:rPr/>
+      </w:pPr>
+      <w:r>
+        <w:rPr/>
+        <w:t>Интерфейс получает от пользователя два вида входных параметров:</w:t>
+      </w:r>
+    </w:p>
+    <w:p>
+      <w:pPr>
+        <w:pStyle w:val="BodyText"/>
+        <w:rPr/>
+      </w:pPr>
+      <w:r>
+        <w:rPr/>
+        <w:t>1) размерности матриц заданные вручную(вида rows x cols)</w:t>
+      </w:r>
+    </w:p>
+    <w:p>
+      <w:pPr>
+        <w:pStyle w:val="BodyText"/>
+        <w:rPr/>
+      </w:pPr>
+      <w:r>
+        <w:rPr/>
+        <w:t>2) путь к файлу, содержащие размерности</w:t>
+      </w:r>
+    </w:p>
+    <w:p>
+      <w:pPr>
+        <w:pStyle w:val="BodyText"/>
+        <w:rPr/>
+      </w:pPr>
+      <w:r>
+        <w:rPr/>
+        <w:t>3) Количество случайно заданных матриц. После ввода данные передаются в genetic_algorithm.</w:t>
+      </w:r>
+    </w:p>
+    <w:p>
+      <w:pPr>
+        <w:pStyle w:val="BodyText"/>
+        <w:rPr/>
+      </w:pPr>
+      <w:r>
+        <w:rPr/>
+        <w:t>Результатом вызова является список снимков поколений.</w:t>
+      </w:r>
+    </w:p>
+    <w:p>
+      <w:pPr>
+        <w:pStyle w:val="Heading4"/>
+        <w:rPr/>
+      </w:pPr>
+      <w:r>
+        <w:rPr/>
+        <w:t>GUI использует GenerationSnapshot для:</w:t>
+      </w:r>
+    </w:p>
+    <w:p>
+      <w:pPr>
+        <w:pStyle w:val="BodyText"/>
+        <w:numPr>
+          <w:ilvl w:val="0"/>
+          <w:numId w:val="5"/>
+        </w:numPr>
+        <w:ind w:hanging="0" w:start="709"/>
+        <w:rPr/>
+      </w:pPr>
+      <w:r>
+        <w:rPr/>
+        <w:t>отображения текущего лучшего решения и его стоимости;</w:t>
+      </w:r>
+    </w:p>
+    <w:p>
+      <w:pPr>
+        <w:pStyle w:val="BodyText"/>
+        <w:numPr>
+          <w:ilvl w:val="0"/>
+          <w:numId w:val="5"/>
+        </w:numPr>
+        <w:ind w:hanging="0" w:start="709"/>
+        <w:rPr/>
+      </w:pPr>
+      <w:r>
+        <w:rPr/>
+        <w:t>визуализации порядка перемножения (дерево или последовательность скобок);</w:t>
+      </w:r>
+    </w:p>
+    <w:p>
+      <w:pPr>
+        <w:pStyle w:val="BodyText"/>
+        <w:numPr>
+          <w:ilvl w:val="0"/>
+          <w:numId w:val="5"/>
+        </w:numPr>
+        <w:ind w:hanging="0" w:start="709"/>
+        <w:rPr/>
+      </w:pPr>
+      <w:r>
+        <w:rPr/>
+        <w:t>построения графика изменения лучшей и средней стоимости от поколения;</w:t>
+      </w:r>
+    </w:p>
+    <w:p>
+      <w:pPr>
+        <w:pStyle w:val="BodyText"/>
+        <w:numPr>
+          <w:ilvl w:val="0"/>
+          <w:numId w:val="5"/>
+        </w:numPr>
+        <w:ind w:hanging="0" w:start="709"/>
+        <w:rPr/>
+      </w:pPr>
+      <w:r>
+        <w:rPr/>
+        <w:t>пошаговой навигации по истории (вперёд, назад, переход к последнему шагу).</w:t>
+      </w:r>
+    </w:p>
+    <w:p>
+      <w:pPr>
+        <w:pStyle w:val="BodyText"/>
+        <w:rPr/>
+      </w:pPr>
+      <w:r>
+        <w:rPr/>
+        <w:t>Возможность отката на несколько шагов реализуется за счёт сохранения полной популяции в каждом снимке и вызова genetic_algorithm с параметром population, равным сохранённой популяции требуемого поколения. Это позволяет продолжить эволюцию с любой предыдущей точки без пересчёта всей истории.</w:t>
+      </w:r>
+    </w:p>
+    <w:p>
+      <w:pPr>
+        <w:pStyle w:val="BodyText"/>
+        <w:rPr/>
+      </w:pPr>
+      <w:r>
+        <w:rPr/>
+        <w:t>Структура компонентов алгоритма и связи алгоритма с графическим интерфейсом приведена на рис. 1 и 2.</w:t>
+      </w:r>
+      <w:r>
+        <w:br w:type="page"/>
+      </w:r>
+    </w:p>
+    <w:p>
+      <w:pPr>
+        <w:pStyle w:val="Heading3"/>
+        <w:ind w:hanging="0" w:start="0"/>
+        <w:rPr/>
+      </w:pPr>
+      <w:r>
+        <w:rPr/>
+        <w:t xml:space="preserve">2.2. </w:t>
+      </w:r>
+      <w:r>
+        <w:rPr/>
+        <w:t>GUI</w:t>
+      </w:r>
+    </w:p>
+    <w:p>
+      <w:pPr>
+        <w:pStyle w:val="BodyText"/>
+        <w:rPr/>
+      </w:pPr>
+      <w:r>
+        <w:rPr>
+          <w:rFonts w:ascii="Times New Roman" w:hAnsi="Times New Roman"/>
+        </w:rPr>
+        <w:t xml:space="preserve">Графический интерфейс реализован с использованием библиотеки PySide6. Навигация между основными экранами осуществляется с помощью контейнера </w:t>
+      </w:r>
+      <w:r>
+        <w:rPr>
+          <w:rStyle w:val="SourceText"/>
+          <w:rFonts w:ascii="Times New Roman" w:hAnsi="Times New Roman"/>
+        </w:rPr>
+        <w:t>QStackedWidget</w:t>
+      </w:r>
+      <w:r>
+        <w:rPr>
+          <w:rFonts w:ascii="Times New Roman" w:hAnsi="Times New Roman"/>
+        </w:rPr>
+        <w:t xml:space="preserve">, а управление переходами выполняется из </w:t>
+      </w:r>
+      <w:r>
+        <w:rPr>
+          <w:rStyle w:val="SourceText"/>
+          <w:rFonts w:ascii="Times New Roman" w:hAnsi="Times New Roman"/>
+        </w:rPr>
+        <w:t>MainWindow</w:t>
+      </w:r>
+      <w:r>
+        <w:rPr>
+          <w:rFonts w:ascii="Times New Roman" w:hAnsi="Times New Roman"/>
+        </w:rPr>
+        <w:t xml:space="preserve">. Каждая страница и виджет представляют собой независимый класс-наследник </w:t>
+      </w:r>
+      <w:r>
+        <w:rPr>
+          <w:rStyle w:val="SourceText"/>
+          <w:rFonts w:ascii="Times New Roman" w:hAnsi="Times New Roman"/>
+        </w:rPr>
+        <w:t>QWidget</w:t>
+      </w:r>
+      <w:r>
+        <w:rPr>
+          <w:rFonts w:ascii="Times New Roman" w:hAnsi="Times New Roman"/>
+        </w:rPr>
+        <w:t>/</w:t>
+      </w:r>
+      <w:r>
+        <w:rPr>
+          <w:rStyle w:val="SourceText"/>
+          <w:rFonts w:ascii="Times New Roman" w:hAnsi="Times New Roman"/>
+        </w:rPr>
+        <w:t>QGroupBox</w:t>
+      </w:r>
+      <w:r>
+        <w:rPr>
+          <w:rFonts w:ascii="Times New Roman" w:hAnsi="Times New Roman"/>
+        </w:rPr>
+        <w:t>/</w:t>
+      </w:r>
+      <w:r>
+        <w:rPr>
+          <w:rStyle w:val="SourceText"/>
+          <w:rFonts w:ascii="Times New Roman" w:hAnsi="Times New Roman"/>
+        </w:rPr>
+        <w:t>QDialog</w:t>
+      </w:r>
+      <w:r>
+        <w:rPr>
+          <w:rFonts w:ascii="Times New Roman" w:hAnsi="Times New Roman"/>
+        </w:rPr>
+        <w:t>, взаимодействующий с остальной системой посредством механизма сигналов и слотов.</w:t>
+      </w:r>
+    </w:p>
+    <w:p>
+      <w:pPr>
+        <w:pStyle w:val="BodyText"/>
+        <w:rPr/>
+      </w:pPr>
+      <w:r>
+        <w:rPr>
+          <w:rStyle w:val="Strong"/>
+          <w:rFonts w:ascii="Times New Roman" w:hAnsi="Times New Roman"/>
+        </w:rPr>
+        <w:t xml:space="preserve">WelcomePage — </w:t>
+      </w:r>
+      <w:r>
+        <w:rPr>
+          <w:rFonts w:ascii="Times New Roman" w:hAnsi="Times New Roman"/>
+        </w:rPr>
+        <w:t>стартовая страница приложения. Отображает краткое описание назначения программы и предоставляет пользователю возможность перейти к дашборду (</w:t>
+      </w:r>
+      <w:r>
+        <w:rPr>
+          <w:rStyle w:val="SourceText"/>
+          <w:rFonts w:ascii="Times New Roman" w:hAnsi="Times New Roman"/>
+        </w:rPr>
+        <w:t>next_clicked</w:t>
+      </w:r>
+      <w:r>
+        <w:rPr>
+          <w:rFonts w:ascii="Times New Roman" w:hAnsi="Times New Roman"/>
+        </w:rPr>
+        <w:t>) или завершить работу приложения (</w:t>
+      </w:r>
+      <w:r>
+        <w:rPr>
+          <w:rStyle w:val="SourceText"/>
+          <w:rFonts w:ascii="Times New Roman" w:hAnsi="Times New Roman"/>
+        </w:rPr>
+        <w:t>quit_clicked</w:t>
+      </w:r>
+      <w:r>
+        <w:rPr>
+          <w:rFonts w:ascii="Times New Roman" w:hAnsi="Times New Roman"/>
+        </w:rPr>
+        <w:t>).</w:t>
+      </w:r>
+    </w:p>
+    <w:p>
+      <w:pPr>
+        <w:pStyle w:val="BodyText"/>
+        <w:rPr/>
+      </w:pPr>
+      <w:r>
+        <w:rPr>
+          <w:rStyle w:val="Strong"/>
+          <w:rFonts w:ascii="Times New Roman" w:hAnsi="Times New Roman"/>
+        </w:rPr>
+        <w:t xml:space="preserve">DashboardPage — </w:t>
+      </w:r>
+      <w:r>
+        <w:rPr>
+          <w:rFonts w:ascii="Times New Roman" w:hAnsi="Times New Roman"/>
+        </w:rPr>
+        <w:t xml:space="preserve">главная </w:t>
+      </w:r>
+      <w:r>
+        <w:rPr>
+          <w:rFonts w:ascii="Times New Roman" w:hAnsi="Times New Roman"/>
+        </w:rPr>
+        <w:t xml:space="preserve">страница приложения, </w:t>
+      </w:r>
+      <w:r>
+        <w:rPr>
+          <w:rFonts w:ascii="Times New Roman" w:hAnsi="Times New Roman"/>
+        </w:rPr>
+        <w:t xml:space="preserve">в которой осуществляется </w:t>
+      </w:r>
+      <w:r>
+        <w:rPr>
+          <w:rFonts w:ascii="Times New Roman" w:hAnsi="Times New Roman"/>
+        </w:rPr>
+        <w:t>ввод данных, настройк</w:t>
+      </w:r>
+      <w:r>
+        <w:rPr>
+          <w:rFonts w:ascii="Times New Roman" w:hAnsi="Times New Roman"/>
+        </w:rPr>
+        <w:t>а</w:t>
+      </w:r>
+      <w:r>
+        <w:rPr>
+          <w:rFonts w:ascii="Times New Roman" w:hAnsi="Times New Roman"/>
+        </w:rPr>
+        <w:t xml:space="preserve"> параметров алгоритма и отображение результатов. </w:t>
+      </w:r>
+      <w:r>
+        <w:rPr>
+          <w:rFonts w:ascii="Times New Roman" w:hAnsi="Times New Roman"/>
+        </w:rPr>
+        <w:t>На</w:t>
+      </w:r>
+      <w:r>
+        <w:rPr>
+          <w:rFonts w:ascii="Times New Roman" w:hAnsi="Times New Roman"/>
+        </w:rPr>
+        <w:t xml:space="preserve"> левую панель </w:t>
+      </w:r>
+      <w:r>
+        <w:rPr>
+          <w:rFonts w:ascii="Times New Roman" w:hAnsi="Times New Roman"/>
+        </w:rPr>
+        <w:t xml:space="preserve">вынесены </w:t>
+      </w:r>
+      <w:r>
+        <w:rPr>
+          <w:rFonts w:ascii="Times New Roman" w:hAnsi="Times New Roman"/>
+        </w:rPr>
+        <w:t xml:space="preserve">источник данных, параметры </w:t>
+      </w:r>
+      <w:r>
+        <w:rPr>
+          <w:rFonts w:ascii="Times New Roman" w:hAnsi="Times New Roman"/>
+        </w:rPr>
+        <w:t>генетического алгоритма и</w:t>
+      </w:r>
+      <w:r>
+        <w:rPr>
+          <w:rFonts w:ascii="Times New Roman" w:hAnsi="Times New Roman"/>
+        </w:rPr>
+        <w:t xml:space="preserve"> кнопки управления</w:t>
+      </w:r>
+      <w:r>
+        <w:rPr>
+          <w:rFonts w:ascii="Times New Roman" w:hAnsi="Times New Roman"/>
+        </w:rPr>
+        <w:t>,</w:t>
+      </w:r>
+      <w:r>
+        <w:rPr>
+          <w:rFonts w:ascii="Times New Roman" w:hAnsi="Times New Roman"/>
+        </w:rPr>
+        <w:t xml:space="preserve"> </w:t>
+      </w:r>
+      <w:r>
+        <w:rPr>
+          <w:rFonts w:ascii="Times New Roman" w:hAnsi="Times New Roman"/>
+        </w:rPr>
+        <w:t>на</w:t>
+      </w:r>
+      <w:r>
+        <w:rPr>
+          <w:rFonts w:ascii="Times New Roman" w:hAnsi="Times New Roman"/>
+        </w:rPr>
+        <w:t xml:space="preserve"> правую панель — график сходимости и результат</w:t>
+      </w:r>
+      <w:r>
+        <w:rPr>
+          <w:rFonts w:ascii="Times New Roman" w:hAnsi="Times New Roman"/>
+        </w:rPr>
+        <w:t>ы текущего шага алгоритма</w:t>
+      </w:r>
+      <w:r>
+        <w:rPr>
+          <w:rFonts w:ascii="Times New Roman" w:hAnsi="Times New Roman"/>
+        </w:rPr>
+        <w:t>. Содержит кнопки «Запустить алгоритм» и «Значения по умолчанию»; по нажатию первой собирает матрицы и параметры, проверяет их валидность (</w:t>
+      </w:r>
+      <w:r>
+        <w:rPr>
+          <w:rStyle w:val="SourceText"/>
+          <w:rFonts w:ascii="Times New Roman" w:hAnsi="Times New Roman"/>
+        </w:rPr>
+        <w:t>_validate_input</w:t>
+      </w:r>
+      <w:r>
+        <w:rPr>
+          <w:rFonts w:ascii="Times New Roman" w:hAnsi="Times New Roman"/>
+        </w:rPr>
+        <w:t xml:space="preserve">) и запускает расчёт через </w:t>
+      </w:r>
+      <w:r>
+        <w:rPr>
+          <w:rStyle w:val="SourceText"/>
+          <w:rFonts w:ascii="Times New Roman" w:hAnsi="Times New Roman"/>
+        </w:rPr>
+        <w:t>get_plot_data</w:t>
+      </w:r>
+      <w:r>
+        <w:rPr>
+          <w:rFonts w:ascii="Times New Roman" w:hAnsi="Times New Roman"/>
+        </w:rPr>
+        <w:t>, после чего обновляет график и результаты.</w:t>
+      </w:r>
+    </w:p>
+    <w:p>
+      <w:pPr>
+        <w:pStyle w:val="BodyText"/>
+        <w:rPr/>
+      </w:pPr>
+      <w:r>
+        <w:rPr>
+          <w:rStyle w:val="Strong"/>
+          <w:rFonts w:ascii="Times New Roman" w:hAnsi="Times New Roman"/>
+        </w:rPr>
+        <w:t xml:space="preserve">ChoiceBoard </w:t>
+      </w:r>
+      <w:r>
+        <w:rPr>
+          <w:rFonts w:ascii="Times New Roman" w:hAnsi="Times New Roman"/>
+        </w:rPr>
+        <w:t xml:space="preserve">— виджет выбора способа </w:t>
+      </w:r>
+      <w:r>
+        <w:rPr>
+          <w:rFonts w:ascii="Times New Roman" w:hAnsi="Times New Roman"/>
+        </w:rPr>
+        <w:t xml:space="preserve">ввода </w:t>
+      </w:r>
+      <w:r>
+        <w:rPr>
+          <w:rFonts w:ascii="Times New Roman" w:hAnsi="Times New Roman"/>
+        </w:rPr>
+        <w:t>матриц. Пользователь может выбрать один из трёх режимов, переключаемых кнопками:</w:t>
+      </w:r>
+    </w:p>
+    <w:p>
+      <w:pPr>
+        <w:pStyle w:val="BodyText"/>
+        <w:numPr>
+          <w:ilvl w:val="0"/>
+          <w:numId w:val="7"/>
+        </w:numPr>
+        <w:tabs>
+          <w:tab w:val="clear" w:pos="709"/>
+          <w:tab w:val="left" w:pos="0" w:leader="none"/>
+        </w:tabs>
+        <w:ind w:firstLine="426" w:start="709"/>
+        <w:rPr/>
+      </w:pPr>
+      <w:r>
+        <w:rPr/>
+        <w:t>случайная генерация заданного количества матриц;</w:t>
+      </w:r>
+    </w:p>
+    <w:p>
+      <w:pPr>
+        <w:pStyle w:val="BodyText"/>
+        <w:numPr>
+          <w:ilvl w:val="0"/>
+          <w:numId w:val="7"/>
+        </w:numPr>
+        <w:tabs>
+          <w:tab w:val="clear" w:pos="709"/>
+          <w:tab w:val="left" w:pos="0" w:leader="none"/>
+        </w:tabs>
+        <w:ind w:firstLine="426" w:start="709"/>
+        <w:rPr/>
+      </w:pPr>
+      <w:r>
+        <w:rPr>
+          <w:rFonts w:ascii="Times New Roman" w:hAnsi="Times New Roman"/>
+        </w:rPr>
+        <w:t xml:space="preserve">загрузка данных из текстового файла через </w:t>
+      </w:r>
+      <w:r>
+        <w:rPr>
+          <w:rStyle w:val="SourceText"/>
+          <w:rFonts w:ascii="Times New Roman" w:hAnsi="Times New Roman"/>
+        </w:rPr>
+        <w:t>QFileDialog</w:t>
+      </w:r>
+      <w:r>
+        <w:rPr>
+          <w:rFonts w:ascii="Times New Roman" w:hAnsi="Times New Roman"/>
+        </w:rPr>
+        <w:t xml:space="preserve">; </w:t>
+      </w:r>
+    </w:p>
+    <w:p>
+      <w:pPr>
+        <w:pStyle w:val="BodyText"/>
+        <w:numPr>
+          <w:ilvl w:val="0"/>
+          <w:numId w:val="7"/>
+        </w:numPr>
+        <w:tabs>
+          <w:tab w:val="clear" w:pos="709"/>
+          <w:tab w:val="left" w:pos="0" w:leader="none"/>
+        </w:tabs>
+        <w:ind w:firstLine="426" w:start="709"/>
+        <w:rPr/>
+      </w:pPr>
+      <w:r>
+        <w:rPr>
+          <w:rFonts w:ascii="Times New Roman" w:hAnsi="Times New Roman"/>
+        </w:rPr>
+        <w:t xml:space="preserve">ручной ввод размеров матриц через диалоговое окно </w:t>
+      </w:r>
+      <w:r>
+        <w:rPr>
+          <w:rStyle w:val="SourceText"/>
+          <w:rFonts w:ascii="Times New Roman" w:hAnsi="Times New Roman"/>
+        </w:rPr>
+        <w:t>ManualInputDialog</w:t>
+      </w:r>
+      <w:r>
+        <w:rPr>
+          <w:rFonts w:ascii="Times New Roman" w:hAnsi="Times New Roman"/>
+        </w:rPr>
+        <w:t>.</w:t>
+      </w:r>
+    </w:p>
+    <w:p>
+      <w:pPr>
+        <w:pStyle w:val="BodyText"/>
+        <w:rPr/>
+      </w:pPr>
+      <w:r>
+        <w:rPr>
+          <w:rFonts w:ascii="Times New Roman" w:hAnsi="Times New Roman"/>
+        </w:rPr>
+        <w:t>При смене источника интерфейс перестраивается (</w:t>
+      </w:r>
+      <w:r>
+        <w:rPr>
+          <w:rStyle w:val="SourceText"/>
+          <w:rFonts w:ascii="Times New Roman" w:hAnsi="Times New Roman"/>
+        </w:rPr>
+        <w:t>_on_source_changed</w:t>
+      </w:r>
+      <w:r>
+        <w:rPr>
+          <w:rFonts w:ascii="Times New Roman" w:hAnsi="Times New Roman"/>
+        </w:rPr>
+        <w:t xml:space="preserve">): активными становятся только элементы управления, относящиеся к выбранному режиму, а список ранее полученных матриц и статус сбрасываются. Список сформированных матриц отображается в </w:t>
+      </w:r>
+      <w:r>
+        <w:rPr>
+          <w:rStyle w:val="SourceText"/>
+          <w:rFonts w:ascii="Times New Roman" w:hAnsi="Times New Roman"/>
+        </w:rPr>
+        <w:t>QListWidget</w:t>
+      </w:r>
+      <w:r>
+        <w:rPr>
+          <w:rFonts w:ascii="Times New Roman" w:hAnsi="Times New Roman"/>
+        </w:rPr>
+        <w:t xml:space="preserve">, а статус операции (успех/ошибка) — в текстовой метке с цветовой индикацией. При изменении набора матриц испускается сигнал </w:t>
+      </w:r>
+      <w:r>
+        <w:rPr>
+          <w:rStyle w:val="SourceText"/>
+          <w:rFonts w:ascii="Times New Roman" w:hAnsi="Times New Roman"/>
+        </w:rPr>
+        <w:t>matrices_changed</w:t>
+      </w:r>
+      <w:r>
+        <w:rPr>
+          <w:rFonts w:ascii="Times New Roman" w:hAnsi="Times New Roman"/>
+        </w:rPr>
+        <w:t>.</w:t>
+      </w:r>
+    </w:p>
+    <w:p>
+      <w:pPr>
+        <w:pStyle w:val="BodyText"/>
+        <w:rPr/>
+      </w:pPr>
+      <w:r>
+        <w:rPr>
+          <w:rStyle w:val="Strong"/>
+          <w:rFonts w:ascii="Times New Roman" w:hAnsi="Times New Roman"/>
+        </w:rPr>
+        <w:t xml:space="preserve">ManualInputDialog — </w:t>
+      </w:r>
+      <w:r>
+        <w:rPr>
+          <w:rFonts w:ascii="Times New Roman" w:hAnsi="Times New Roman"/>
+        </w:rPr>
+        <w:t>диалог ручного ввода цепочки матриц. Позволяет последовательно добавлять размеры (высоту и ширину) очередной матрицы и автоматически проверяет совместимость цепочки на каждом шаге (совпадение соседних размерностей). Предусмотрена возможность удаления последней добавленной матрицы. Кнопка подтверждения («Готово») становится доступна только после добавления не менее двух совместимых матриц; статус-метка подсказывает пользователю текущее состояние («Добавьте матрицы», «Можно считать», «Данные матрицы невозможно перемножить» и т.д.).</w:t>
+      </w:r>
+    </w:p>
+    <w:p>
+      <w:pPr>
+        <w:pStyle w:val="BodyText"/>
+        <w:rPr/>
+      </w:pPr>
+      <w:r>
+        <w:rPr>
+          <w:rStyle w:val="Strong"/>
+          <w:rFonts w:ascii="Times New Roman" w:hAnsi="Times New Roman"/>
+        </w:rPr>
+        <w:t>GAParamsPanel</w:t>
+      </w:r>
+      <w:r>
+        <w:rPr>
+          <w:rFonts w:ascii="Times New Roman" w:hAnsi="Times New Roman"/>
+        </w:rPr>
+        <w:t xml:space="preserve"> — панель настройки параметров генетического алгоритма: размер популяции, число поколений, вероятность мутации и вероятность скрещивания. Каждый параметр снабжён подсказкой (</w:t>
+      </w:r>
+      <w:r>
+        <w:rPr>
+          <w:rStyle w:val="SourceText"/>
+          <w:rFonts w:ascii="Times New Roman" w:hAnsi="Times New Roman"/>
+        </w:rPr>
+        <w:t>HintLabel</w:t>
+      </w:r>
+      <w:r>
+        <w:rPr>
+          <w:rFonts w:ascii="Times New Roman" w:hAnsi="Times New Roman"/>
+        </w:rPr>
+        <w:t>) с всплывающей информацией об его влиянии на работу алгоритма. Предусмотрена кнопка сброса к значениям по умолчанию.</w:t>
+      </w:r>
+    </w:p>
+    <w:p>
+      <w:pPr>
+        <w:pStyle w:val="BodyText"/>
+        <w:rPr>
+          <w:rFonts w:ascii="Times New Roman" w:hAnsi="Times New Roman"/>
+        </w:rPr>
+      </w:pPr>
+      <w:r>
+        <w:rPr>
+          <w:rFonts w:ascii="Times New Roman" w:hAnsi="Times New Roman"/>
+        </w:rPr>
+        <w:t xml:space="preserve">Справа с помощью </w:t>
+      </w:r>
+      <w:r>
+        <w:rPr>
+          <w:rStyle w:val="SourceText"/>
+          <w:rFonts w:ascii="Times New Roman" w:hAnsi="Times New Roman"/>
+        </w:rPr>
+        <w:t xml:space="preserve">pyqtgraph </w:t>
+      </w:r>
+      <w:r>
+        <w:rPr>
+          <w:rFonts w:ascii="Times New Roman" w:hAnsi="Times New Roman"/>
+        </w:rPr>
+        <w:t>рисуется</w:t>
+      </w:r>
+      <w:r>
+        <w:rPr>
+          <w:rFonts w:ascii="Times New Roman" w:hAnsi="Times New Roman"/>
+        </w:rPr>
+        <w:t xml:space="preserve"> график </w:t>
+      </w:r>
+      <w:r>
+        <w:rPr>
+          <w:rFonts w:ascii="Times New Roman" w:hAnsi="Times New Roman"/>
+        </w:rPr>
+        <w:t xml:space="preserve">динамики сходимости алгоритма с </w:t>
+      </w:r>
+      <w:r>
+        <w:rPr>
+          <w:rFonts w:ascii="Times New Roman" w:hAnsi="Times New Roman"/>
+        </w:rPr>
+        <w:t>тр</w:t>
+      </w:r>
+      <w:r>
+        <w:rPr>
+          <w:rFonts w:ascii="Times New Roman" w:hAnsi="Times New Roman"/>
+        </w:rPr>
+        <w:t>емя</w:t>
+      </w:r>
+      <w:r>
+        <w:rPr>
+          <w:rFonts w:ascii="Times New Roman" w:hAnsi="Times New Roman"/>
+        </w:rPr>
+        <w:t xml:space="preserve"> кривы</w:t>
+      </w:r>
+      <w:r>
+        <w:rPr>
+          <w:rFonts w:ascii="Times New Roman" w:hAnsi="Times New Roman"/>
+        </w:rPr>
+        <w:t>ми</w:t>
+      </w:r>
+      <w:r>
+        <w:rPr>
+          <w:rFonts w:ascii="Times New Roman" w:hAnsi="Times New Roman"/>
+        </w:rPr>
+        <w:t>: динамика лучшего значения поколения, динамика среднего значения поколения и линия целевого отношения.</w:t>
+      </w:r>
+    </w:p>
+    <w:p>
+      <w:pPr>
+        <w:pStyle w:val="BodyText"/>
+        <w:rPr/>
+      </w:pPr>
+      <w:r>
+        <w:rPr>
+          <w:rStyle w:val="Strong"/>
+          <w:rFonts w:ascii="Times New Roman" w:hAnsi="Times New Roman"/>
+        </w:rPr>
+        <w:t xml:space="preserve">ResultsPanel </w:t>
+      </w:r>
+      <w:r>
+        <w:rPr>
+          <w:rFonts w:ascii="Times New Roman" w:hAnsi="Times New Roman"/>
+        </w:rPr>
+        <w:t>— панель отображения итоговых результатов работы алгоритма: лучшая найденная стоимость, отношение к целевому значению, номер поколения, на котором достигнут лучший результат, и найденный порядок умножения матриц. До получения данных все поля отображают «</w:t>
+      </w:r>
+      <w:r>
+        <w:rPr>
+          <w:rFonts w:ascii="Times New Roman" w:hAnsi="Times New Roman"/>
+        </w:rPr>
+        <w:t>-»</w:t>
+      </w:r>
+      <w:r>
+        <w:rPr>
+          <w:rFonts w:ascii="Times New Roman" w:hAnsi="Times New Roman"/>
+        </w:rPr>
+        <w:t>.</w:t>
+      </w:r>
+    </w:p>
+    <w:p>
+      <w:pPr>
+        <w:pStyle w:val="BodyText"/>
+        <w:rPr/>
+      </w:pPr>
+      <w:r>
+        <w:rPr>
+          <w:rStyle w:val="Strong"/>
+          <w:rFonts w:ascii="Times New Roman" w:hAnsi="Times New Roman"/>
+        </w:rPr>
+        <w:t>MainWindow</w:t>
+      </w:r>
+      <w:r>
+        <w:rPr>
+          <w:rFonts w:ascii="Times New Roman" w:hAnsi="Times New Roman"/>
+        </w:rPr>
+        <w:t xml:space="preserve"> — главное окно приложения, объединяющее обе страницы в единый интерфейс.</w:t>
+      </w:r>
+    </w:p>
+    <w:p>
+      <w:pPr>
+        <w:pStyle w:val="BodyText"/>
+        <w:numPr>
+          <w:ilvl w:val="0"/>
+          <w:numId w:val="8"/>
+        </w:numPr>
+        <w:tabs>
+          <w:tab w:val="clear" w:pos="709"/>
+          <w:tab w:val="left" w:pos="0" w:leader="none"/>
+        </w:tabs>
+        <w:ind w:firstLine="426" w:start="709"/>
+        <w:rPr/>
+      </w:pPr>
+      <w:r>
+        <w:rPr>
+          <w:rFonts w:ascii="Times New Roman" w:hAnsi="Times New Roman"/>
+        </w:rPr>
+        <w:t xml:space="preserve">создаёт экземпляры </w:t>
+      </w:r>
+      <w:r>
+        <w:rPr>
+          <w:rStyle w:val="SourceText"/>
+          <w:rFonts w:ascii="Times New Roman" w:hAnsi="Times New Roman"/>
+        </w:rPr>
+        <w:t>WelcomePage</w:t>
+      </w:r>
+      <w:r>
+        <w:rPr>
+          <w:rFonts w:ascii="Times New Roman" w:hAnsi="Times New Roman"/>
+        </w:rPr>
+        <w:t xml:space="preserve"> и </w:t>
+      </w:r>
+      <w:r>
+        <w:rPr>
+          <w:rStyle w:val="SourceText"/>
+          <w:rFonts w:ascii="Times New Roman" w:hAnsi="Times New Roman"/>
+        </w:rPr>
+        <w:t>DashboardPage</w:t>
+      </w:r>
+      <w:r>
+        <w:rPr>
+          <w:rFonts w:ascii="Times New Roman" w:hAnsi="Times New Roman"/>
+        </w:rPr>
+        <w:t xml:space="preserve">; </w:t>
+      </w:r>
+    </w:p>
+    <w:p>
+      <w:pPr>
+        <w:pStyle w:val="BodyText"/>
+        <w:numPr>
+          <w:ilvl w:val="0"/>
+          <w:numId w:val="8"/>
+        </w:numPr>
+        <w:tabs>
+          <w:tab w:val="clear" w:pos="709"/>
+          <w:tab w:val="left" w:pos="0" w:leader="none"/>
+        </w:tabs>
+        <w:ind w:firstLine="426" w:start="709"/>
+        <w:rPr/>
+      </w:pPr>
+      <w:r>
+        <w:rPr>
+          <w:rFonts w:ascii="Times New Roman" w:hAnsi="Times New Roman"/>
+        </w:rPr>
+        <w:t xml:space="preserve">размещает их в </w:t>
+      </w:r>
+      <w:r>
+        <w:rPr>
+          <w:rStyle w:val="SourceText"/>
+          <w:rFonts w:ascii="Times New Roman" w:hAnsi="Times New Roman"/>
+        </w:rPr>
+        <w:t>QStackedWidget</w:t>
+      </w:r>
+      <w:r>
+        <w:rPr>
+          <w:rFonts w:ascii="Times New Roman" w:hAnsi="Times New Roman"/>
+        </w:rPr>
+        <w:t xml:space="preserve">; </w:t>
+      </w:r>
+    </w:p>
+    <w:p>
+      <w:pPr>
+        <w:pStyle w:val="BodyText"/>
+        <w:numPr>
+          <w:ilvl w:val="0"/>
+          <w:numId w:val="8"/>
+        </w:numPr>
+        <w:tabs>
+          <w:tab w:val="clear" w:pos="709"/>
+          <w:tab w:val="left" w:pos="0" w:leader="none"/>
+        </w:tabs>
+        <w:ind w:firstLine="426" w:start="709"/>
+        <w:rPr/>
+      </w:pPr>
+      <w:r>
+        <w:rPr>
+          <w:rFonts w:ascii="Times New Roman" w:hAnsi="Times New Roman"/>
+        </w:rPr>
+        <w:t>обрабатывает сигналы навигации (</w:t>
+      </w:r>
+      <w:r>
+        <w:rPr>
+          <w:rStyle w:val="SourceText"/>
+          <w:rFonts w:ascii="Times New Roman" w:hAnsi="Times New Roman"/>
+        </w:rPr>
+        <w:t>next_clicked</w:t>
+      </w:r>
+      <w:r>
+        <w:rPr>
+          <w:rFonts w:ascii="Times New Roman" w:hAnsi="Times New Roman"/>
+        </w:rPr>
+        <w:t xml:space="preserve">, </w:t>
+      </w:r>
+      <w:r>
+        <w:rPr>
+          <w:rStyle w:val="SourceText"/>
+          <w:rFonts w:ascii="Times New Roman" w:hAnsi="Times New Roman"/>
+        </w:rPr>
+        <w:t>quit_clicked</w:t>
+      </w:r>
+      <w:r>
+        <w:rPr>
+          <w:rFonts w:ascii="Times New Roman" w:hAnsi="Times New Roman"/>
+        </w:rPr>
+        <w:t xml:space="preserve">), определяя переход между приветственной страницей и дашбордом; </w:t>
+      </w:r>
+    </w:p>
+    <w:p>
+      <w:pPr>
+        <w:pStyle w:val="BodyText"/>
+        <w:numPr>
+          <w:ilvl w:val="0"/>
+          <w:numId w:val="8"/>
+        </w:numPr>
+        <w:tabs>
+          <w:tab w:val="clear" w:pos="709"/>
+          <w:tab w:val="left" w:pos="0" w:leader="none"/>
+        </w:tabs>
+        <w:ind w:firstLine="426" w:start="709"/>
+        <w:rPr/>
+      </w:pPr>
+      <w:r>
+        <w:rPr/>
+        <w:t>устанавливает стартовую страницу и общие параметры окна (заголовок, размер).</w:t>
+      </w:r>
+    </w:p>
+    <w:p>
+      <w:pPr>
+        <w:pStyle w:val="BodyText"/>
+        <w:rPr/>
+      </w:pPr>
+      <w:r>
+        <w:rPr/>
       </w:r>
     </w:p>
     <w:p>
@@ -2029,681 +3099,10 @@
         </w:numPr>
         <w:rPr/>
       </w:pPr>
-      <w:bookmarkStart w:id="8" w:name="_Toc230206151"/>
-      <w:r>
-        <w:rPr/>
-        <w:t xml:space="preserve">2.2. </w:t>
+      <w:r>
+        <w:rPr/>
       </w:r>
       <w:bookmarkEnd w:id="8"/>
-      <w:r>
-        <w:rPr/>
-        <w:t>Генетический алгоритм</w:t>
-      </w:r>
-    </w:p>
-    <w:p>
-      <w:pPr>
-        <w:pStyle w:val="BodyText"/>
-        <w:rPr/>
-      </w:pPr>
-      <w:bookmarkStart w:id="9" w:name="_Toc230206152"/>
-      <w:r>
-        <w:rPr/>
-        <w:t>Генетический алгоритм решает задачу минимизации числа скалярных умножений при перемножении цепочки матриц. Решение (особь) кодируется как список целых чисел — на каждом шаге умножения ген указывает индекс матрицы в текущем списке размерностей, которая будет перемножена со следующей. Длина хромосомы равна </w:t>
-      </w:r>
-      <w:r>
-        <w:rPr>
-          <w:rStyle w:val="katex-mathml"/>
-          <w:color w:val="F9FAFB"/>
-          <w:sz w:val="29"/>
-          <w:szCs w:val="29"/>
-        </w:rPr>
-        <w:t>N−2</w:t>
-      </w:r>
-      <w:r>
-        <w:rPr>
-          <w:rStyle w:val="mord"/>
-          <w:rFonts w:ascii="KaTeX_Math" w:hAnsi="KaTeX_Math"/>
-          <w:i/>
-          <w:iCs/>
-          <w:color w:val="F9FAFB"/>
-          <w:sz w:val="29"/>
-          <w:szCs w:val="29"/>
-        </w:rPr>
-        <w:t>N</w:t>
-      </w:r>
-      <w:r>
-        <w:rPr>
-          <w:rStyle w:val="mbin"/>
-          <w:color w:val="F9FAFB"/>
-          <w:sz w:val="29"/>
-          <w:szCs w:val="29"/>
-        </w:rPr>
-        <w:t>−</w:t>
-      </w:r>
-      <w:r>
-        <w:rPr>
-          <w:rStyle w:val="mord"/>
-          <w:color w:val="F9FAFB"/>
-          <w:sz w:val="29"/>
-          <w:szCs w:val="29"/>
-        </w:rPr>
-        <w:t>2</w:t>
-      </w:r>
-      <w:r>
-        <w:rPr/>
-        <w:t>, где </w:t>
-      </w:r>
-      <w:r>
-        <w:rPr>
-          <w:rStyle w:val="katex-mathml"/>
-          <w:color w:val="F9FAFB"/>
-          <w:sz w:val="29"/>
-          <w:szCs w:val="29"/>
-        </w:rPr>
-        <w:t>N</w:t>
-      </w:r>
-      <w:r>
-        <w:rPr>
-          <w:rStyle w:val="mord"/>
-          <w:rFonts w:ascii="KaTeX_Math" w:hAnsi="KaTeX_Math"/>
-          <w:i/>
-          <w:iCs/>
-          <w:color w:val="F9FAFB"/>
-          <w:sz w:val="29"/>
-          <w:szCs w:val="29"/>
-        </w:rPr>
-        <w:t>N</w:t>
-      </w:r>
-      <w:r>
-        <w:rPr/>
-        <w:t> — количество матриц. Такой способ гарантирует корректность любого случайно сгенерированного решения без дополнительной валидации.</w:t>
-      </w:r>
-    </w:p>
-    <w:p>
-      <w:pPr>
-        <w:pStyle w:val="Heading4"/>
-        <w:rPr/>
-      </w:pPr>
-      <w:r>
-        <w:rPr/>
-        <w:t>Основные компоненты алгоритма:</w:t>
-      </w:r>
-    </w:p>
-    <w:p>
-      <w:pPr>
-        <w:pStyle w:val="BodyText"/>
-        <w:numPr>
-          <w:ilvl w:val="0"/>
-          <w:numId w:val="5"/>
-        </w:numPr>
-        <w:ind w:hanging="0" w:start="709"/>
-        <w:rPr/>
-      </w:pPr>
-      <w:r>
-        <w:rPr/>
-        <w:t>generate_individual — создаёт случайную особь, где каждый ген gi лежит в диапазоне [0,  len−3−i].</w:t>
-      </w:r>
-    </w:p>
-    <w:p>
-      <w:pPr>
-        <w:pStyle w:val="BodyText"/>
-        <w:numPr>
-          <w:ilvl w:val="0"/>
-          <w:numId w:val="5"/>
-        </w:numPr>
-        <w:ind w:hanging="0" w:start="709"/>
-        <w:rPr/>
-      </w:pPr>
-      <w:r>
-        <w:rPr/>
-        <w:t>calculate_cost — вычисляет функцию приспособленности: последовательно перемножает матрицы согласно порядку, заданному хромосомой, и суммирует затраты pa​</w:t>
-      </w:r>
-      <w:r>
-        <w:rPr>
-          <w:rFonts w:cs="Cambria Math" w:ascii="Cambria Math" w:hAnsi="Cambria Math"/>
-        </w:rPr>
-        <w:t>⋅</w:t>
-      </w:r>
-      <w:r>
-        <w:rPr/>
-        <w:t>pb​</w:t>
-      </w:r>
-      <w:r>
-        <w:rPr>
-          <w:rFonts w:cs="Cambria Math" w:ascii="Cambria Math" w:hAnsi="Cambria Math"/>
-        </w:rPr>
-        <w:t>⋅</w:t>
-      </w:r>
-      <w:r>
-        <w:rPr/>
-        <w:t>pc​ на каждом шаге.</w:t>
-      </w:r>
-    </w:p>
-    <w:p>
-      <w:pPr>
-        <w:pStyle w:val="BodyText"/>
-        <w:numPr>
-          <w:ilvl w:val="0"/>
-          <w:numId w:val="5"/>
-        </w:numPr>
-        <w:ind w:hanging="0" w:start="709"/>
-        <w:rPr/>
-      </w:pPr>
-      <w:r>
-        <w:rPr/>
-        <w:t>calculate_min_cost — эталонный метод динамического программирования для верификации, возвращает глобальный минимум.</w:t>
-      </w:r>
-    </w:p>
-    <w:p>
-      <w:pPr>
-        <w:pStyle w:val="BodyText"/>
-        <w:numPr>
-          <w:ilvl w:val="0"/>
-          <w:numId w:val="5"/>
-        </w:numPr>
-        <w:ind w:hanging="0" w:start="709"/>
-        <w:rPr/>
-      </w:pPr>
-      <w:r>
-        <w:rPr/>
-        <w:t>tournament — турнирная селекция: из трёх случайно выбранных особей побеждает особь с наименьшей стоимостью.</w:t>
-      </w:r>
-    </w:p>
-    <w:p>
-      <w:pPr>
-        <w:pStyle w:val="BodyText"/>
-        <w:numPr>
-          <w:ilvl w:val="0"/>
-          <w:numId w:val="5"/>
-        </w:numPr>
-        <w:ind w:hanging="0" w:start="709"/>
-        <w:rPr/>
-      </w:pPr>
-      <w:r>
-        <w:rPr/>
-        <w:t>crossover — одноточечное скрещивание, порождающее двух детей; корректность потомков обеспечивается одинаковой структурой допустимых значений генов на соответствующих позициях.</w:t>
-      </w:r>
-    </w:p>
-    <w:p>
-      <w:pPr>
-        <w:pStyle w:val="BodyText"/>
-        <w:numPr>
-          <w:ilvl w:val="0"/>
-          <w:numId w:val="5"/>
-        </w:numPr>
-        <w:ind w:hanging="0" w:start="709"/>
-        <w:rPr/>
-      </w:pPr>
-      <w:r>
-        <w:rPr/>
-        <w:t>mutate — независимая мутация каждого гена с вероятностью pm​, заменяющая ген на случайное допустимое значение.</w:t>
-      </w:r>
-    </w:p>
-    <w:p>
-      <w:pPr>
-        <w:pStyle w:val="BodyText"/>
-        <w:numPr>
-          <w:ilvl w:val="0"/>
-          <w:numId w:val="5"/>
-        </w:numPr>
-        <w:ind w:hanging="0" w:start="709"/>
-        <w:rPr/>
-      </w:pPr>
-      <w:r>
-        <w:rPr/>
-        <w:t>selection — формирует новое поколение: попарно отбирает родителей, с вероятностью pc​ скрещивает, применяет мутацию.</w:t>
-      </w:r>
-    </w:p>
-    <w:p>
-      <w:pPr>
-        <w:pStyle w:val="BodyText"/>
-        <w:numPr>
-          <w:ilvl w:val="0"/>
-          <w:numId w:val="5"/>
-        </w:numPr>
-        <w:ind w:hanging="0" w:start="709"/>
-        <w:rPr/>
-      </w:pPr>
-      <w:r>
-        <w:rPr/>
-        <w:t>genetic_algorithm — управляющая функция, принимает параметры (размер популяции, число поколений, вероятности операторов, начальную популяцию и размерности) и возвращает историю поколений в виде списка GenerationSnapshot вместе с глобальным минимумом.</w:t>
-      </w:r>
-    </w:p>
-    <w:p>
-      <w:pPr>
-        <w:pStyle w:val="BodyText"/>
-        <w:numPr>
-          <w:ilvl w:val="0"/>
-          <w:numId w:val="5"/>
-        </w:numPr>
-        <w:ind w:hanging="0" w:start="709"/>
-        <w:rPr/>
-      </w:pPr>
-      <w:r>
-        <w:rPr/>
-        <w:t>Датакласс GenerationSnapshot фиксирует состояние популяции на каждом поколении: номер поколения, лучшую и среднюю стоимость, хромосому лучшего решения и полную популяцию (глубокая копия). Эти данные являются связующим звеном между вычислительным ядром и графическим интерфейсом.</w:t>
-      </w:r>
-    </w:p>
-    <w:p>
-      <w:pPr>
-        <w:pStyle w:val="Heading4"/>
-        <w:rPr/>
-      </w:pPr>
-      <w:r>
-        <w:rPr/>
-        <w:t>Связь с GUI</w:t>
-      </w:r>
-    </w:p>
-    <w:p>
-      <w:pPr>
-        <w:pStyle w:val="BodyText"/>
-        <w:rPr/>
-      </w:pPr>
-      <w:r>
-        <w:rPr/>
-        <w:t>Интерфейс получает от пользователя два вида входных параметров: 1) размерности матриц заданные вручную(вида rows x cols), 2) путь к файлу, содержащие размерности, 3) Количество случайно заданных матриц. После ввода данные передаются в genetic_algorithm. Результатом вызова является список снимков поколений.</w:t>
-      </w:r>
-    </w:p>
-    <w:p>
-      <w:pPr>
-        <w:pStyle w:val="Heading4"/>
-        <w:rPr/>
-      </w:pPr>
-      <w:r>
-        <w:rPr/>
-        <w:t>GUI использует GenerationSnapshot для:</w:t>
-      </w:r>
-    </w:p>
-    <w:p>
-      <w:pPr>
-        <w:pStyle w:val="BodyText"/>
-        <w:numPr>
-          <w:ilvl w:val="0"/>
-          <w:numId w:val="5"/>
-        </w:numPr>
-        <w:ind w:hanging="0" w:start="709"/>
-        <w:rPr/>
-      </w:pPr>
-      <w:r>
-        <w:rPr/>
-        <w:t>отображения текущего лучшего решения и его стоимости;</w:t>
-      </w:r>
-    </w:p>
-    <w:p>
-      <w:pPr>
-        <w:pStyle w:val="BodyText"/>
-        <w:numPr>
-          <w:ilvl w:val="0"/>
-          <w:numId w:val="5"/>
-        </w:numPr>
-        <w:ind w:hanging="0" w:start="709"/>
-        <w:rPr/>
-      </w:pPr>
-      <w:r>
-        <w:rPr/>
-        <w:t>визуализации порядка перемножения (дерево или последовательность скобок);</w:t>
-      </w:r>
-    </w:p>
-    <w:p>
-      <w:pPr>
-        <w:pStyle w:val="BodyText"/>
-        <w:numPr>
-          <w:ilvl w:val="0"/>
-          <w:numId w:val="5"/>
-        </w:numPr>
-        <w:ind w:hanging="0" w:start="709"/>
-        <w:rPr/>
-      </w:pPr>
-      <w:r>
-        <w:rPr/>
-        <w:t>построения графика изменения лучшей и средней стоимости от поколения;</w:t>
-      </w:r>
-    </w:p>
-    <w:p>
-      <w:pPr>
-        <w:pStyle w:val="BodyText"/>
-        <w:numPr>
-          <w:ilvl w:val="0"/>
-          <w:numId w:val="5"/>
-        </w:numPr>
-        <w:ind w:hanging="0" w:start="709"/>
-        <w:rPr/>
-      </w:pPr>
-      <w:r>
-        <w:rPr/>
-        <w:t>пошаговой навигации по истории (вперёд, назад, переход к последнему шагу).</w:t>
-      </w:r>
-    </w:p>
-    <w:p>
-      <w:pPr>
-        <w:pStyle w:val="BodyText"/>
-        <w:rPr/>
-      </w:pPr>
-      <w:r>
-        <w:rPr/>
-        <w:t>Возможность отката на несколько шагов реализуется за счёт сохранения полной популяции в каждом снимке и вызова genetic_algorithm с параметром population, равным сохранённой популяции требуемого поколения. Это позволяет продолжить эволюцию с любой предыдущей точки без пересчёта всей истории.</w:t>
-      </w:r>
-    </w:p>
-    <w:p>
-      <w:pPr>
-        <w:pStyle w:val="Heading4"/>
-        <w:widowControl/>
-        <w:suppressAutoHyphens w:val="true"/>
-        <w:bidi w:val="0"/>
-        <w:spacing w:lineRule="auto" w:line="360" w:before="0" w:after="0"/>
-        <w:ind w:start="708"/>
-        <w:jc w:val="both"/>
-        <w:rPr>
-          <w:rFonts w:ascii="Times New Roman" w:hAnsi="Times New Roman" w:cs="Cambria"/>
-          <w:b/>
-          <w:bCs/>
-          <w:kern w:val="2"/>
-          <w:sz w:val="28"/>
-          <w:szCs w:val="28"/>
-        </w:rPr>
-      </w:pPr>
-      <w:r>
-        <w:rPr>
-          <w:rFonts w:cs="Cambria"/>
-          <w:b/>
-          <w:bCs/>
-          <w:kern w:val="2"/>
-          <w:sz w:val="28"/>
-          <w:szCs w:val="28"/>
-        </w:rPr>
-      </w:r>
-    </w:p>
-    <w:p>
-      <w:pPr>
-        <w:pStyle w:val="Heading4"/>
-        <w:widowControl/>
-        <w:suppressAutoHyphens w:val="true"/>
-        <w:bidi w:val="0"/>
-        <w:spacing w:lineRule="auto" w:line="360" w:before="0" w:after="0"/>
-        <w:ind w:start="708"/>
-        <w:jc w:val="both"/>
-        <w:rPr>
-          <w:rFonts w:ascii="Times New Roman" w:hAnsi="Times New Roman" w:cs="Cambria"/>
-          <w:b/>
-          <w:bCs/>
-          <w:kern w:val="2"/>
-          <w:sz w:val="28"/>
-          <w:szCs w:val="28"/>
-        </w:rPr>
-      </w:pPr>
-      <w:r>
-        <w:rPr>
-          <w:rFonts w:cs="Cambria"/>
-          <w:b/>
-          <w:bCs/>
-          <w:kern w:val="2"/>
-          <w:sz w:val="28"/>
-          <w:szCs w:val="28"/>
-        </w:rPr>
-        <w:t>GUI</w:t>
-      </w:r>
-    </w:p>
-    <w:p>
-      <w:pPr>
-        <w:pStyle w:val="BodyText"/>
-        <w:rPr/>
-      </w:pPr>
-      <w:r>
-        <w:rPr/>
-        <w:t>Графический интерфейс реализован с использованием библиотеки PySide6. Навигация между экранами осуществляется с помощью контейнера QStackedWidget, а управление переходами выполняется из MainWindow. Каждая страница представляет собой независимый класс-наследник QWidget, взаимодействующий с остальной системой посредством механизма сигналов и слотов.</w:t>
-      </w:r>
-    </w:p>
-    <w:p>
-      <w:pPr>
-        <w:pStyle w:val="BodyText"/>
-        <w:rPr/>
-      </w:pPr>
-      <w:r>
-        <w:rPr/>
-      </w:r>
-    </w:p>
-    <w:p>
-      <w:pPr>
-        <w:pStyle w:val="BodyText"/>
-        <w:rPr/>
-      </w:pPr>
-      <w:r>
-        <w:rPr/>
-        <w:t>Основные компоненты интерфейса:</w:t>
-      </w:r>
-    </w:p>
-    <w:p>
-      <w:pPr>
-        <w:pStyle w:val="BodyText"/>
-        <w:numPr>
-          <w:ilvl w:val="0"/>
-          <w:numId w:val="7"/>
-        </w:numPr>
-        <w:rPr/>
-      </w:pPr>
-      <w:r>
-        <w:rPr/>
-        <w:t>WelcomePage — стартовая страница приложения. Отображает краткое описание назначения программы и предоставляет пользователю возможность перейти к следующему этапу или завершить работу приложения.</w:t>
-      </w:r>
-    </w:p>
-    <w:p>
-      <w:pPr>
-        <w:pStyle w:val="BodyText"/>
-        <w:numPr>
-          <w:ilvl w:val="0"/>
-          <w:numId w:val="7"/>
-        </w:numPr>
-        <w:rPr/>
-      </w:pPr>
-      <w:r>
-        <w:rPr/>
-        <w:t>ChoicePage — страница выбора способа получения входных данных. Пользователь может выбрать один из трёх режимов:</w:t>
-      </w:r>
-    </w:p>
-    <w:p>
-      <w:pPr>
-        <w:pStyle w:val="BodyText"/>
-        <w:numPr>
-          <w:ilvl w:val="2"/>
-          <w:numId w:val="7"/>
-        </w:numPr>
-        <w:rPr/>
-      </w:pPr>
-      <w:r>
-        <w:rPr/>
-        <w:t>случайная генерация размеров матриц;</w:t>
-      </w:r>
-    </w:p>
-    <w:p>
-      <w:pPr>
-        <w:pStyle w:val="BodyText"/>
-        <w:numPr>
-          <w:ilvl w:val="2"/>
-          <w:numId w:val="7"/>
-        </w:numPr>
-        <w:rPr/>
-      </w:pPr>
-      <w:r>
-        <w:rPr/>
-        <w:t>загрузка данных из текстового файла;</w:t>
-      </w:r>
-    </w:p>
-    <w:p>
-      <w:pPr>
-        <w:pStyle w:val="BodyText"/>
-        <w:numPr>
-          <w:ilvl w:val="2"/>
-          <w:numId w:val="7"/>
-        </w:numPr>
-        <w:rPr/>
-      </w:pPr>
-      <w:r>
-        <w:rPr/>
-        <w:t>ручной ввод размеров матриц.</w:t>
-      </w:r>
-    </w:p>
-    <w:p>
-      <w:pPr>
-        <w:pStyle w:val="BodyText"/>
-        <w:numPr>
-          <w:ilvl w:val="0"/>
-          <w:numId w:val="7"/>
-        </w:numPr>
-        <w:rPr/>
-      </w:pPr>
-      <w:r>
-        <w:rPr/>
-        <w:t>ManualInputPage — страница ручного ввода размерностей матриц. Позволяет последовательно добавлять размеры матриц в цепочку, автоматически проверяя корректность их совместимости.. После ввода как минимум двух совместимых матриц становится доступен переход к следующему этапу.</w:t>
-      </w:r>
-    </w:p>
-    <w:p>
-      <w:pPr>
-        <w:pStyle w:val="BodyText"/>
-        <w:numPr>
-          <w:ilvl w:val="0"/>
-          <w:numId w:val="7"/>
-        </w:numPr>
-        <w:rPr/>
-      </w:pPr>
-      <w:r>
-        <w:rPr/>
-        <w:t>GraphPage — страница визуализации результатов работы алгоритма. Использует библиотеку pyqtgraph для построения графика зависимости лучшего значения функции приспособленности от номера поколения Предусмотрена возможность повторного построения графика без возврата к предыдущим этапам.</w:t>
-      </w:r>
-    </w:p>
-    <w:p>
-      <w:pPr>
-        <w:pStyle w:val="BodyText"/>
-        <w:numPr>
-          <w:ilvl w:val="0"/>
-          <w:numId w:val="7"/>
-        </w:numPr>
-        <w:rPr/>
-      </w:pPr>
-      <w:r>
-        <w:rPr/>
-        <w:t>MainWindow — главное окно приложения, объединяющее все страницы в единый интерфейс. Выполняет функции координатора работы программы:</w:t>
-      </w:r>
-    </w:p>
-    <w:p>
-      <w:pPr>
-        <w:pStyle w:val="BodyText"/>
-        <w:numPr>
-          <w:ilvl w:val="2"/>
-          <w:numId w:val="7"/>
-        </w:numPr>
-        <w:rPr/>
-      </w:pPr>
-      <w:r>
-        <w:rPr/>
-        <w:t>создаёт экземпляры всех страниц;</w:t>
-      </w:r>
-    </w:p>
-    <w:p>
-      <w:pPr>
-        <w:pStyle w:val="BodyText"/>
-        <w:numPr>
-          <w:ilvl w:val="2"/>
-          <w:numId w:val="7"/>
-        </w:numPr>
-        <w:rPr/>
-      </w:pPr>
-      <w:r>
-        <w:rPr/>
-        <w:t>организует их размещение в QStackedWidget;</w:t>
-      </w:r>
-    </w:p>
-    <w:p>
-      <w:pPr>
-        <w:pStyle w:val="BodyText"/>
-        <w:numPr>
-          <w:ilvl w:val="2"/>
-          <w:numId w:val="7"/>
-        </w:numPr>
-        <w:rPr/>
-      </w:pPr>
-      <w:r>
-        <w:rPr/>
-        <w:t>обрабатывает сигналы пользовательского интерфейса;</w:t>
-      </w:r>
-    </w:p>
-    <w:p>
-      <w:pPr>
-        <w:pStyle w:val="BodyText"/>
-        <w:numPr>
-          <w:ilvl w:val="2"/>
-          <w:numId w:val="7"/>
-        </w:numPr>
-        <w:rPr/>
-      </w:pPr>
-      <w:r>
-        <w:rPr/>
-        <w:t>определяет дальнейший маршрут выполнения программы в зависимости от выбранного способа ввода данных;</w:t>
-      </w:r>
-    </w:p>
-    <w:p>
-      <w:pPr>
-        <w:pStyle w:val="BodyText"/>
-        <w:numPr>
-          <w:ilvl w:val="2"/>
-          <w:numId w:val="7"/>
-        </w:numPr>
-        <w:rPr/>
-      </w:pPr>
-      <w:r>
-        <w:rPr/>
-        <w:t>загружает данные из файла, генерирует случайные матрицы либо принимает введённые пользователем размерности;</w:t>
-      </w:r>
-    </w:p>
-    <w:p>
-      <w:pPr>
-        <w:pStyle w:val="BodyText"/>
-        <w:numPr>
-          <w:ilvl w:val="2"/>
-          <w:numId w:val="7"/>
-        </w:numPr>
-        <w:rPr/>
-      </w:pPr>
-      <w:r>
-        <w:rPr/>
-        <w:t>передаёт подготовленные данные странице визуализации.</w:t>
-      </w:r>
-    </w:p>
-    <w:p>
-      <w:pPr>
-        <w:pStyle w:val="BodyText"/>
-        <w:numPr>
-          <w:ilvl w:val="0"/>
-          <w:numId w:val="7"/>
-        </w:numPr>
-        <w:rPr/>
-      </w:pPr>
-      <w:r>
-        <w:rPr/>
-        <w:t>Перечисление Choice — определяет возможные варианты источника входных данных (CHOICE_RANDOM, CHOICE_FILE, CHOICE_MANUAL) и используется для унификации обмена информацией между страницами интерфейса и главным окном.</w:t>
-      </w:r>
-    </w:p>
-    <w:p>
-      <w:pPr>
-        <w:pStyle w:val="BodyText"/>
-        <w:rPr/>
-      </w:pPr>
-      <w:r>
-        <w:rPr/>
-      </w:r>
-    </w:p>
-    <w:p>
-      <w:pPr>
-        <w:pStyle w:val="Heading3"/>
-        <w:numPr>
-          <w:ilvl w:val="2"/>
-          <w:numId w:val="2"/>
-        </w:numPr>
-        <w:rPr/>
-      </w:pPr>
-      <w:r>
-        <w:rPr/>
-      </w:r>
-      <w:bookmarkEnd w:id="9"/>
       <w:r>
         <w:br w:type="page"/>
       </w:r>
@@ -2718,31 +3117,20 @@
         <w:spacing w:before="0" w:after="0"/>
         <w:rPr/>
       </w:pPr>
-      <w:bookmarkStart w:id="10" w:name="_Toc230206153"/>
+      <w:bookmarkStart w:id="9" w:name="_Toc230206153"/>
       <w:r>
         <w:rPr/>
         <w:t>3 ИСПОЛЬЗУЕМЫЕ ТЕХНОЛОГИИ</w:t>
       </w:r>
-      <w:bookmarkEnd w:id="10"/>
-    </w:p>
-    <w:p>
-      <w:pPr>
-        <w:pStyle w:val="BodyText"/>
-        <w:rPr/>
-      </w:pPr>
-      <w:r>
-        <w:rPr/>
-        <w:t>В данной главе опишите технологии, которые использовались вами при выполнении задач в рамках практики.</w:t>
-      </w:r>
-    </w:p>
-    <w:p>
-      <w:pPr>
-        <w:pStyle w:val="BodyText"/>
-        <w:rPr/>
-      </w:pPr>
-      <w:r>
-        <w:rPr/>
-        <w:t>Это могут быть языки программирования, списки конкретных библиотек / ПО и целей / мест их применения.</w:t>
+      <w:bookmarkEnd w:id="9"/>
+    </w:p>
+    <w:p>
+      <w:pPr>
+        <w:pStyle w:val="BodyText"/>
+        <w:rPr/>
+      </w:pPr>
+      <w:r>
+        <w:rPr/>
       </w:r>
       <w:r>
         <w:br w:type="page"/>
@@ -2758,12 +3146,12 @@
         <w:spacing w:before="0" w:after="0"/>
         <w:rPr/>
       </w:pPr>
-      <w:bookmarkStart w:id="11" w:name="_Toc230206154"/>
+      <w:bookmarkStart w:id="10" w:name="_Toc230206154"/>
       <w:r>
         <w:rPr/>
         <w:t>4 ОТЗЫВ РУКОВОДИТЕЛЯ</w:t>
       </w:r>
-      <w:bookmarkEnd w:id="11"/>
+      <w:bookmarkEnd w:id="10"/>
     </w:p>
     <w:p>
       <w:pPr>
@@ -2916,12 +3304,12 @@
           <w:rFonts w:cs="Times New Roman"/>
         </w:rPr>
       </w:pPr>
-      <w:bookmarkStart w:id="12" w:name="_Toc230206155"/>
+      <w:bookmarkStart w:id="11" w:name="_Toc230206155"/>
       <w:r>
         <w:rPr/>
         <w:t>ЗАКЛЮЧЕНИЕ</w:t>
       </w:r>
-      <w:bookmarkEnd w:id="12"/>
+      <w:bookmarkEnd w:id="11"/>
     </w:p>
     <w:p>
       <w:pPr>
@@ -2964,22 +3352,22 @@
           <w:rFonts w:cs="Times New Roman"/>
         </w:rPr>
       </w:pPr>
-      <w:bookmarkStart w:id="13" w:name="_Toc230206156"/>
-      <w:bookmarkStart w:id="14" w:name="_Toc73173388"/>
+      <w:bookmarkStart w:id="12" w:name="_Toc230206156"/>
+      <w:bookmarkStart w:id="13" w:name="_Toc73173388"/>
       <w:r>
         <w:rPr>
           <w:rFonts w:cs="Times New Roman"/>
         </w:rPr>
         <w:t>СПИСОК ИСПОЛЬЗОВАННЫХ ИСТОЧНИКОВ</w:t>
       </w:r>
-      <w:bookmarkEnd w:id="14"/>
+      <w:bookmarkEnd w:id="13"/>
       <w:r>
         <w:rPr>
           <w:rFonts w:cs="Times New Roman"/>
         </w:rPr>
         <w:t xml:space="preserve"> </w:t>
       </w:r>
-      <w:bookmarkEnd w:id="13"/>
+      <w:bookmarkEnd w:id="12"/>
     </w:p>
     <w:p>
       <w:pPr>
@@ -3074,47 +3462,186 @@
           <w:rFonts w:cs="Times New Roman"/>
         </w:rPr>
       </w:pPr>
-      <w:bookmarkStart w:id="15" w:name="_Toc230206157"/>
+      <w:bookmarkStart w:id="14" w:name="_Toc230206157"/>
       <w:r>
         <w:rPr>
           <w:rFonts w:cs="Times New Roman"/>
           <w:color w:val="000000"/>
         </w:rPr>
-        <w:t xml:space="preserve">ПРИЛОЖЕНИЕ А </w:t>
-      </w:r>
+        <w:t>ПРИЛОЖЕНИЕ А</w:t>
+      </w:r>
+      <w:bookmarkEnd w:id="14"/>
       <w:r>
         <w:rPr>
           <w:rFonts w:cs="Times New Roman"/>
-          <w:color w:val="EE0000"/>
-        </w:rPr>
-        <w:t>(заголовок второго уровня)</w:t>
-      </w:r>
-      <w:bookmarkEnd w:id="15"/>
-    </w:p>
-    <w:p>
-      <w:pPr>
-        <w:pStyle w:val="List"/>
-        <w:numPr>
-          <w:ilvl w:val="0"/>
-          <w:numId w:val="0"/>
-        </w:numPr>
-        <w:ind w:hanging="0" w:start="0"/>
+          <w:color w:val="000000"/>
+        </w:rPr>
+        <w:t xml:space="preserve"> </w:t>
+        <w:br/>
+      </w:r>
+      <w:r>
         <w:rPr>
           <w:rFonts w:cs="Times New Roman"/>
+          <w:color w:val="000000"/>
+        </w:rPr>
+        <w:t>Диаграмма классов</w:t>
+      </w:r>
+    </w:p>
+    <w:p>
+      <w:pPr>
+        <w:pStyle w:val="BodyText"/>
+        <w:ind w:hanging="0"/>
+        <w:jc w:val="center"/>
+        <w:rPr/>
+      </w:pPr>
+      <w:r>
+        <w:rPr/>
+        <w:drawing>
+          <wp:inline distT="0" distB="0" distL="0" distR="0">
+            <wp:extent cx="5467350" cy="6400800"/>
+            <wp:effectExtent l="0" t="0" r="0" b="0"/>
+            <wp:docPr id="2" name="Image2"/>
+            <wp:cNvGraphicFramePr>
+              <a:graphicFrameLocks xmlns:a="http://schemas.openxmlformats.org/drawingml/2006/main" noChangeAspect="1"/>
+            </wp:cNvGraphicFramePr>
+            <a:graphic xmlns:a="http://schemas.openxmlformats.org/drawingml/2006/main">
+              <a:graphicData uri="http://schemas.openxmlformats.org/drawingml/2006/picture">
+                <pic:pic xmlns:pic="http://schemas.openxmlformats.org/drawingml/2006/picture">
+                  <pic:nvPicPr>
+                    <pic:cNvPr id="2" name="Image2"/>
+                    <pic:cNvPicPr>
+                      <a:picLocks noChangeAspect="1" noChangeArrowheads="1"/>
+                    </pic:cNvPicPr>
+                  </pic:nvPicPr>
+                  <pic:blipFill>
+                    <a:blip r:embed="rId3"/>
+                    <a:stretch>
+                      <a:fillRect/>
+                    </a:stretch>
+                  </pic:blipFill>
+                  <pic:spPr bwMode="auto">
+                    <a:xfrm>
+                      <a:off x="0" y="0"/>
+                      <a:ext cx="5467350" cy="6400800"/>
+                    </a:xfrm>
+                    <a:prstGeom prst="rect">
+                      <a:avLst/>
+                    </a:prstGeom>
+                    <a:noFill/>
+                  </pic:spPr>
+                </pic:pic>
+              </a:graphicData>
+            </a:graphic>
+          </wp:inline>
+        </w:drawing>
+      </w:r>
+    </w:p>
+    <w:p>
+      <w:pPr>
+        <w:pStyle w:val="BodyText"/>
+        <w:ind w:hanging="0"/>
+        <w:jc w:val="center"/>
+        <w:rPr/>
+      </w:pPr>
+      <w:r>
+        <w:rPr/>
+        <w:t xml:space="preserve">Рисунок </w:t>
+      </w:r>
+      <w:r>
+        <w:rPr/>
+        <w:t>1</w:t>
+      </w:r>
+      <w:r>
+        <w:rPr/>
+        <w:t xml:space="preserve"> — </w:t>
+      </w:r>
+      <w:r>
+        <w:rPr/>
+        <w:t>Диаграмма классов связки GUI и backend</w:t>
+      </w:r>
+    </w:p>
+    <w:p>
+      <w:pPr>
+        <w:pStyle w:val="BodyText"/>
+        <w:ind w:hanging="0"/>
+        <w:jc w:val="center"/>
+        <w:rPr/>
+      </w:pPr>
+      <w:r>
+        <w:rPr/>
+        <w:drawing>
+          <wp:inline distT="0" distB="0" distL="0" distR="0">
+            <wp:extent cx="5940425" cy="5076825"/>
+            <wp:effectExtent l="0" t="0" r="0" b="0"/>
+            <wp:docPr id="3" name="Image1"/>
+            <wp:cNvGraphicFramePr>
+              <a:graphicFrameLocks xmlns:a="http://schemas.openxmlformats.org/drawingml/2006/main" noChangeAspect="1"/>
+            </wp:cNvGraphicFramePr>
+            <a:graphic xmlns:a="http://schemas.openxmlformats.org/drawingml/2006/main">
+              <a:graphicData uri="http://schemas.openxmlformats.org/drawingml/2006/picture">
+                <pic:pic xmlns:pic="http://schemas.openxmlformats.org/drawingml/2006/picture">
+                  <pic:nvPicPr>
+                    <pic:cNvPr id="3" name="Image1"/>
+                    <pic:cNvPicPr>
+                      <a:picLocks noChangeAspect="1" noChangeArrowheads="1"/>
+                    </pic:cNvPicPr>
+                  </pic:nvPicPr>
+                  <pic:blipFill>
+                    <a:blip r:embed="rId4"/>
+                    <a:stretch>
+                      <a:fillRect/>
+                    </a:stretch>
+                  </pic:blipFill>
+                  <pic:spPr bwMode="auto">
+                    <a:xfrm>
+                      <a:off x="0" y="0"/>
+                      <a:ext cx="5940425" cy="5076825"/>
+                    </a:xfrm>
+                    <a:prstGeom prst="rect">
+                      <a:avLst/>
+                    </a:prstGeom>
+                    <a:noFill/>
+                  </pic:spPr>
+                </pic:pic>
+              </a:graphicData>
+            </a:graphic>
+          </wp:inline>
+        </w:drawing>
+      </w:r>
+    </w:p>
+    <w:p>
+      <w:pPr>
+        <w:pStyle w:val="Style19"/>
+        <w:rPr>
+          <w:rFonts w:cs="Cambria"/>
           <w:b/>
           <w:bCs/>
-          <w:sz w:val="26"/>
-          <w:szCs w:val="26"/>
-        </w:rPr>
-      </w:pPr>
-      <w:r>
-        <w:rPr/>
+          <w:caps/>
+          <w:kern w:val="2"/>
+          <w:highlight w:val="lightGray"/>
+        </w:rPr>
+      </w:pPr>
+      <w:r>
+        <w:rPr/>
+        <w:t xml:space="preserve">Рисунок </w:t>
+      </w:r>
+      <w:r>
+        <w:rPr/>
+        <w:t>2</w:t>
+      </w:r>
+      <w:r>
+        <w:rPr/>
+        <w:t xml:space="preserve"> — </w:t>
+      </w:r>
+      <w:r>
+        <w:rPr/>
+        <w:t>Диаграмма классов backend</w:t>
       </w:r>
     </w:p>
     <w:sectPr>
-      <w:footerReference w:type="even" r:id="rId3"/>
-      <w:footerReference w:type="default" r:id="rId4"/>
-      <w:footerReference w:type="first" r:id="rId5"/>
+      <w:footerReference w:type="even" r:id="rId5"/>
+      <w:footerReference w:type="default" r:id="rId6"/>
+      <w:footerReference w:type="first" r:id="rId7"/>
       <w:type w:val="nextPage"/>
       <w:pgSz w:w="11906" w:h="16838"/>
       <w:pgMar w:left="1701" w:right="850" w:gutter="0" w:header="0" w:top="1134" w:footer="708" w:bottom="1134"/>
@@ -3187,7 +3714,7 @@
       <w:rPr>
         <w:rStyle w:val="PageNumber"/>
       </w:rPr>
-      <w:t>13</w:t>
+      <w:t>15</w:t>
     </w:r>
     <w:r>
       <w:rPr>
@@ -4003,9 +4530,9 @@
       <w:lvlJc w:val="start"/>
       <w:pPr>
         <w:tabs>
-          <w:tab w:val="num" w:pos="720"/>
-        </w:tabs>
-        <w:ind w:start="720" w:hanging="360"/>
+          <w:tab w:val="num" w:pos="709"/>
+        </w:tabs>
+        <w:ind w:start="709" w:hanging="283"/>
       </w:pPr>
       <w:rPr>
         <w:rFonts w:ascii="Symbol" w:hAnsi="Symbol" w:cs="Symbol" w:hint="default"/>
@@ -4014,125 +4541,262 @@
     <w:lvl w:ilvl="1">
       <w:start w:val="1"/>
       <w:numFmt w:val="bullet"/>
-      <w:lvlText w:val="◦"/>
-      <w:lvlJc w:val="start"/>
-      <w:pPr>
-        <w:tabs>
-          <w:tab w:val="num" w:pos="1080"/>
-        </w:tabs>
-        <w:ind w:start="1080" w:hanging="360"/>
-      </w:pPr>
-      <w:rPr>
-        <w:rFonts w:ascii="OpenSymbol" w:hAnsi="OpenSymbol" w:cs="OpenSymbol" w:hint="default"/>
-      </w:rPr>
-    </w:lvl>
-    <w:lvl w:ilvl="2">
-      <w:start w:val="1"/>
-      <w:numFmt w:val="bullet"/>
-      <w:lvlText w:val="▪"/>
-      <w:lvlJc w:val="start"/>
-      <w:pPr>
-        <w:tabs>
-          <w:tab w:val="num" w:pos="1440"/>
-        </w:tabs>
-        <w:ind w:start="1440" w:hanging="360"/>
-      </w:pPr>
-      <w:rPr>
-        <w:rFonts w:ascii="OpenSymbol" w:hAnsi="OpenSymbol" w:cs="OpenSymbol" w:hint="default"/>
-      </w:rPr>
-    </w:lvl>
-    <w:lvl w:ilvl="3">
-      <w:start w:val="1"/>
-      <w:numFmt w:val="bullet"/>
       <w:lvlText w:val=""/>
       <w:lvlJc w:val="start"/>
       <w:pPr>
         <w:tabs>
-          <w:tab w:val="num" w:pos="1800"/>
-        </w:tabs>
-        <w:ind w:start="1800" w:hanging="360"/>
+          <w:tab w:val="num" w:pos="1418"/>
+        </w:tabs>
+        <w:ind w:start="1418" w:hanging="283"/>
       </w:pPr>
       <w:rPr>
         <w:rFonts w:ascii="Symbol" w:hAnsi="Symbol" w:cs="Symbol" w:hint="default"/>
       </w:rPr>
     </w:lvl>
-    <w:lvl w:ilvl="4">
-      <w:start w:val="1"/>
-      <w:numFmt w:val="bullet"/>
-      <w:lvlText w:val="◦"/>
-      <w:lvlJc w:val="start"/>
-      <w:pPr>
-        <w:tabs>
-          <w:tab w:val="num" w:pos="2160"/>
-        </w:tabs>
-        <w:ind w:start="2160" w:hanging="360"/>
-      </w:pPr>
-      <w:rPr>
-        <w:rFonts w:ascii="OpenSymbol" w:hAnsi="OpenSymbol" w:cs="OpenSymbol" w:hint="default"/>
-      </w:rPr>
-    </w:lvl>
-    <w:lvl w:ilvl="5">
-      <w:start w:val="1"/>
-      <w:numFmt w:val="bullet"/>
-      <w:lvlText w:val="▪"/>
-      <w:lvlJc w:val="start"/>
-      <w:pPr>
-        <w:tabs>
-          <w:tab w:val="num" w:pos="2520"/>
-        </w:tabs>
-        <w:ind w:start="2520" w:hanging="360"/>
-      </w:pPr>
-      <w:rPr>
-        <w:rFonts w:ascii="OpenSymbol" w:hAnsi="OpenSymbol" w:cs="OpenSymbol" w:hint="default"/>
-      </w:rPr>
-    </w:lvl>
-    <w:lvl w:ilvl="6">
+    <w:lvl w:ilvl="2">
       <w:start w:val="1"/>
       <w:numFmt w:val="bullet"/>
       <w:lvlText w:val=""/>
       <w:lvlJc w:val="start"/>
       <w:pPr>
         <w:tabs>
-          <w:tab w:val="num" w:pos="2880"/>
-        </w:tabs>
-        <w:ind w:start="2880" w:hanging="360"/>
+          <w:tab w:val="num" w:pos="2127"/>
+        </w:tabs>
+        <w:ind w:start="2127" w:hanging="283"/>
       </w:pPr>
       <w:rPr>
         <w:rFonts w:ascii="Symbol" w:hAnsi="Symbol" w:cs="Symbol" w:hint="default"/>
       </w:rPr>
     </w:lvl>
+    <w:lvl w:ilvl="3">
+      <w:start w:val="1"/>
+      <w:numFmt w:val="bullet"/>
+      <w:lvlText w:val=""/>
+      <w:lvlJc w:val="start"/>
+      <w:pPr>
+        <w:tabs>
+          <w:tab w:val="num" w:pos="2836"/>
+        </w:tabs>
+        <w:ind w:start="2836" w:hanging="283"/>
+      </w:pPr>
+      <w:rPr>
+        <w:rFonts w:ascii="Symbol" w:hAnsi="Symbol" w:cs="Symbol" w:hint="default"/>
+      </w:rPr>
+    </w:lvl>
+    <w:lvl w:ilvl="4">
+      <w:start w:val="1"/>
+      <w:numFmt w:val="bullet"/>
+      <w:lvlText w:val=""/>
+      <w:lvlJc w:val="start"/>
+      <w:pPr>
+        <w:tabs>
+          <w:tab w:val="num" w:pos="3545"/>
+        </w:tabs>
+        <w:ind w:start="3545" w:hanging="283"/>
+      </w:pPr>
+      <w:rPr>
+        <w:rFonts w:ascii="Symbol" w:hAnsi="Symbol" w:cs="Symbol" w:hint="default"/>
+      </w:rPr>
+    </w:lvl>
+    <w:lvl w:ilvl="5">
+      <w:start w:val="1"/>
+      <w:numFmt w:val="bullet"/>
+      <w:lvlText w:val=""/>
+      <w:lvlJc w:val="start"/>
+      <w:pPr>
+        <w:tabs>
+          <w:tab w:val="num" w:pos="4254"/>
+        </w:tabs>
+        <w:ind w:start="4254" w:hanging="283"/>
+      </w:pPr>
+      <w:rPr>
+        <w:rFonts w:ascii="Symbol" w:hAnsi="Symbol" w:cs="Symbol" w:hint="default"/>
+      </w:rPr>
+    </w:lvl>
+    <w:lvl w:ilvl="6">
+      <w:start w:val="1"/>
+      <w:numFmt w:val="bullet"/>
+      <w:lvlText w:val=""/>
+      <w:lvlJc w:val="start"/>
+      <w:pPr>
+        <w:tabs>
+          <w:tab w:val="num" w:pos="4963"/>
+        </w:tabs>
+        <w:ind w:start="4963" w:hanging="283"/>
+      </w:pPr>
+      <w:rPr>
+        <w:rFonts w:ascii="Symbol" w:hAnsi="Symbol" w:cs="Symbol" w:hint="default"/>
+      </w:rPr>
+    </w:lvl>
     <w:lvl w:ilvl="7">
       <w:start w:val="1"/>
       <w:numFmt w:val="bullet"/>
-      <w:lvlText w:val="◦"/>
-      <w:lvlJc w:val="start"/>
-      <w:pPr>
-        <w:tabs>
-          <w:tab w:val="num" w:pos="3240"/>
-        </w:tabs>
-        <w:ind w:start="3240" w:hanging="360"/>
+      <w:lvlText w:val=""/>
+      <w:lvlJc w:val="start"/>
+      <w:pPr>
+        <w:tabs>
+          <w:tab w:val="num" w:pos="5672"/>
+        </w:tabs>
+        <w:ind w:start="5672" w:hanging="283"/>
       </w:pPr>
       <w:rPr>
-        <w:rFonts w:ascii="OpenSymbol" w:hAnsi="OpenSymbol" w:cs="OpenSymbol" w:hint="default"/>
+        <w:rFonts w:ascii="Symbol" w:hAnsi="Symbol" w:cs="Symbol" w:hint="default"/>
       </w:rPr>
     </w:lvl>
     <w:lvl w:ilvl="8">
       <w:start w:val="1"/>
       <w:numFmt w:val="bullet"/>
-      <w:lvlText w:val="▪"/>
-      <w:lvlJc w:val="start"/>
-      <w:pPr>
-        <w:tabs>
-          <w:tab w:val="num" w:pos="3600"/>
-        </w:tabs>
-        <w:ind w:start="3600" w:hanging="360"/>
+      <w:lvlText w:val=""/>
+      <w:lvlJc w:val="start"/>
+      <w:pPr>
+        <w:tabs>
+          <w:tab w:val="num" w:pos="6381"/>
+        </w:tabs>
+        <w:ind w:start="6381" w:hanging="283"/>
       </w:pPr>
       <w:rPr>
-        <w:rFonts w:ascii="OpenSymbol" w:hAnsi="OpenSymbol" w:cs="OpenSymbol" w:hint="default"/>
+        <w:rFonts w:ascii="Symbol" w:hAnsi="Symbol" w:cs="Symbol" w:hint="default"/>
       </w:rPr>
     </w:lvl>
   </w:abstractNum>
   <w:abstractNum w:abstractNumId="8">
+    <w:lvl w:ilvl="0">
+      <w:start w:val="1"/>
+      <w:numFmt w:val="bullet"/>
+      <w:lvlText w:val=""/>
+      <w:lvlJc w:val="start"/>
+      <w:pPr>
+        <w:tabs>
+          <w:tab w:val="num" w:pos="709"/>
+        </w:tabs>
+        <w:ind w:start="709" w:hanging="283"/>
+      </w:pPr>
+      <w:rPr>
+        <w:rFonts w:ascii="Symbol" w:hAnsi="Symbol" w:cs="Symbol" w:hint="default"/>
+      </w:rPr>
+    </w:lvl>
+    <w:lvl w:ilvl="1">
+      <w:start w:val="1"/>
+      <w:numFmt w:val="bullet"/>
+      <w:lvlText w:val=""/>
+      <w:lvlJc w:val="start"/>
+      <w:pPr>
+        <w:tabs>
+          <w:tab w:val="num" w:pos="1418"/>
+        </w:tabs>
+        <w:ind w:start="1418" w:hanging="283"/>
+      </w:pPr>
+      <w:rPr>
+        <w:rFonts w:ascii="Symbol" w:hAnsi="Symbol" w:cs="Symbol" w:hint="default"/>
+      </w:rPr>
+    </w:lvl>
+    <w:lvl w:ilvl="2">
+      <w:start w:val="1"/>
+      <w:numFmt w:val="bullet"/>
+      <w:lvlText w:val=""/>
+      <w:lvlJc w:val="start"/>
+      <w:pPr>
+        <w:tabs>
+          <w:tab w:val="num" w:pos="2127"/>
+        </w:tabs>
+        <w:ind w:start="2127" w:hanging="283"/>
+      </w:pPr>
+      <w:rPr>
+        <w:rFonts w:ascii="Symbol" w:hAnsi="Symbol" w:cs="Symbol" w:hint="default"/>
+      </w:rPr>
+    </w:lvl>
+    <w:lvl w:ilvl="3">
+      <w:start w:val="1"/>
+      <w:numFmt w:val="bullet"/>
+      <w:lvlText w:val=""/>
+      <w:lvlJc w:val="start"/>
+      <w:pPr>
+        <w:tabs>
+          <w:tab w:val="num" w:pos="2836"/>
+        </w:tabs>
+        <w:ind w:start="2836" w:hanging="283"/>
+      </w:pPr>
+      <w:rPr>
+        <w:rFonts w:ascii="Symbol" w:hAnsi="Symbol" w:cs="Symbol" w:hint="default"/>
+      </w:rPr>
+    </w:lvl>
+    <w:lvl w:ilvl="4">
+      <w:start w:val="1"/>
+      <w:numFmt w:val="bullet"/>
+      <w:lvlText w:val=""/>
+      <w:lvlJc w:val="start"/>
+      <w:pPr>
+        <w:tabs>
+          <w:tab w:val="num" w:pos="3545"/>
+        </w:tabs>
+        <w:ind w:start="3545" w:hanging="283"/>
+      </w:pPr>
+      <w:rPr>
+        <w:rFonts w:ascii="Symbol" w:hAnsi="Symbol" w:cs="Symbol" w:hint="default"/>
+      </w:rPr>
+    </w:lvl>
+    <w:lvl w:ilvl="5">
+      <w:start w:val="1"/>
+      <w:numFmt w:val="bullet"/>
+      <w:lvlText w:val=""/>
+      <w:lvlJc w:val="start"/>
+      <w:pPr>
+        <w:tabs>
+          <w:tab w:val="num" w:pos="4254"/>
+        </w:tabs>
+        <w:ind w:start="4254" w:hanging="283"/>
+      </w:pPr>
+      <w:rPr>
+        <w:rFonts w:ascii="Symbol" w:hAnsi="Symbol" w:cs="Symbol" w:hint="default"/>
+      </w:rPr>
+    </w:lvl>
+    <w:lvl w:ilvl="6">
+      <w:start w:val="1"/>
+      <w:numFmt w:val="bullet"/>
+      <w:lvlText w:val=""/>
+      <w:lvlJc w:val="start"/>
+      <w:pPr>
+        <w:tabs>
+          <w:tab w:val="num" w:pos="4963"/>
+        </w:tabs>
+        <w:ind w:start="4963" w:hanging="283"/>
+      </w:pPr>
+      <w:rPr>
+        <w:rFonts w:ascii="Symbol" w:hAnsi="Symbol" w:cs="Symbol" w:hint="default"/>
+      </w:rPr>
+    </w:lvl>
+    <w:lvl w:ilvl="7">
+      <w:start w:val="1"/>
+      <w:numFmt w:val="bullet"/>
+      <w:lvlText w:val=""/>
+      <w:lvlJc w:val="start"/>
+      <w:pPr>
+        <w:tabs>
+          <w:tab w:val="num" w:pos="5672"/>
+        </w:tabs>
+        <w:ind w:start="5672" w:hanging="283"/>
+      </w:pPr>
+      <w:rPr>
+        <w:rFonts w:ascii="Symbol" w:hAnsi="Symbol" w:cs="Symbol" w:hint="default"/>
+      </w:rPr>
+    </w:lvl>
+    <w:lvl w:ilvl="8">
+      <w:start w:val="1"/>
+      <w:numFmt w:val="bullet"/>
+      <w:lvlText w:val=""/>
+      <w:lvlJc w:val="start"/>
+      <w:pPr>
+        <w:tabs>
+          <w:tab w:val="num" w:pos="6381"/>
+        </w:tabs>
+        <w:ind w:start="6381" w:hanging="283"/>
+      </w:pPr>
+      <w:rPr>
+        <w:rFonts w:ascii="Symbol" w:hAnsi="Symbol" w:cs="Symbol" w:hint="default"/>
+      </w:rPr>
+    </w:lvl>
+  </w:abstractNum>
+  <w:abstractNum w:abstractNumId="9">
     <w:lvl w:ilvl="0">
       <w:start w:val="1"/>
       <w:numFmt w:val="none"/>
@@ -4274,6 +4938,9 @@
   </w:num>
   <w:num w:numId="8">
     <w:abstractNumId w:val="8"/>
+  </w:num>
+  <w:num w:numId="9">
+    <w:abstractNumId w:val="9"/>
   </w:num>
 </w:numbering>
 </file>
@@ -4970,6 +5637,18 @@
       <w:rFonts w:ascii="Liberation Mono" w:hAnsi="Liberation Mono" w:eastAsia="Noto Sans Mono CJK SC" w:cs="Liberation Mono"/>
     </w:rPr>
   </w:style>
+  <w:style w:type="character" w:styleId="Bulletsuser">
+    <w:name w:val="Bullets (user)"/>
+    <w:qFormat/>
+    <w:rPr>
+      <w:rFonts w:ascii="OpenSymbol" w:hAnsi="OpenSymbol" w:eastAsia="OpenSymbol" w:cs="OpenSymbol"/>
+    </w:rPr>
+  </w:style>
+  <w:style w:type="character" w:styleId="NumberingSymbols">
+    <w:name w:val="Numbering Symbols"/>
+    <w:qFormat/>
+    <w:rPr/>
+  </w:style>
   <w:style w:type="character" w:styleId="Bullets">
     <w:name w:val="Bullets"/>
     <w:qFormat/>

</xml_diff>

<commit_message>
fix: small report fix
</commit_message>
<xml_diff>
--- a/УЧПРАКТИКА_4345_Бабий_Кравцов_Гаврилов.docx
+++ b/УЧПРАКТИКА_4345_Бабий_Кравцов_Гаврилов.docx
@@ -529,11 +529,11 @@
         <w:tblLook w:noHBand="0" w:noVBand="0" w:firstColumn="0" w:lastRow="0" w:lastColumn="0" w:firstRow="0" w:val="0000"/>
       </w:tblPr>
       <w:tblGrid>
-        <w:gridCol w:w="2631"/>
+        <w:gridCol w:w="2630"/>
         <w:gridCol w:w="1448"/>
-        <w:gridCol w:w="2470"/>
-        <w:gridCol w:w="255"/>
-        <w:gridCol w:w="2551"/>
+        <w:gridCol w:w="2471"/>
+        <w:gridCol w:w="254"/>
+        <w:gridCol w:w="2552"/>
       </w:tblGrid>
       <w:tr>
         <w:trPr>
@@ -541,7 +541,7 @@
         </w:trPr>
         <w:tc>
           <w:tcPr>
-            <w:tcW w:w="2631" w:type="dxa"/>
+            <w:tcW w:w="2630" w:type="dxa"/>
             <w:tcBorders/>
             <w:vAlign w:val="bottom"/>
           </w:tcPr>
@@ -585,7 +585,7 @@
         </w:tc>
         <w:tc>
           <w:tcPr>
-            <w:tcW w:w="2470" w:type="dxa"/>
+            <w:tcW w:w="2471" w:type="dxa"/>
             <w:tcBorders>
               <w:bottom w:val="single" w:sz="4" w:space="0" w:color="000000"/>
             </w:tcBorders>
@@ -610,7 +610,7 @@
         </w:tc>
         <w:tc>
           <w:tcPr>
-            <w:tcW w:w="255" w:type="dxa"/>
+            <w:tcW w:w="254" w:type="dxa"/>
             <w:tcBorders/>
           </w:tcPr>
           <w:p>
@@ -632,7 +632,7 @@
         </w:tc>
         <w:tc>
           <w:tcPr>
-            <w:tcW w:w="2551" w:type="dxa"/>
+            <w:tcW w:w="2552" w:type="dxa"/>
             <w:tcBorders/>
             <w:vAlign w:val="bottom"/>
           </w:tcPr>
@@ -698,7 +698,7 @@
         </w:trPr>
         <w:tc>
           <w:tcPr>
-            <w:tcW w:w="2631" w:type="dxa"/>
+            <w:tcW w:w="2630" w:type="dxa"/>
             <w:tcBorders/>
             <w:vAlign w:val="bottom"/>
           </w:tcPr>
@@ -746,7 +746,7 @@
         </w:tc>
         <w:tc>
           <w:tcPr>
-            <w:tcW w:w="2470" w:type="dxa"/>
+            <w:tcW w:w="2471" w:type="dxa"/>
             <w:tcBorders>
               <w:top w:val="single" w:sz="4" w:space="0" w:color="000000"/>
             </w:tcBorders>
@@ -770,7 +770,7 @@
         </w:tc>
         <w:tc>
           <w:tcPr>
-            <w:tcW w:w="255" w:type="dxa"/>
+            <w:tcW w:w="254" w:type="dxa"/>
             <w:tcBorders/>
           </w:tcPr>
           <w:p>
@@ -792,7 +792,7 @@
         </w:tc>
         <w:tc>
           <w:tcPr>
-            <w:tcW w:w="2551" w:type="dxa"/>
+            <w:tcW w:w="2552" w:type="dxa"/>
             <w:tcBorders/>
           </w:tcPr>
           <w:p>
@@ -821,7 +821,7 @@
         </w:trPr>
         <w:tc>
           <w:tcPr>
-            <w:tcW w:w="2631" w:type="dxa"/>
+            <w:tcW w:w="2630" w:type="dxa"/>
             <w:tcBorders/>
             <w:vAlign w:val="bottom"/>
           </w:tcPr>
@@ -864,7 +864,7 @@
         </w:tc>
         <w:tc>
           <w:tcPr>
-            <w:tcW w:w="2470" w:type="dxa"/>
+            <w:tcW w:w="2471" w:type="dxa"/>
             <w:tcBorders>
               <w:bottom w:val="single" w:sz="4" w:space="0" w:color="000000"/>
             </w:tcBorders>
@@ -889,7 +889,7 @@
         </w:tc>
         <w:tc>
           <w:tcPr>
-            <w:tcW w:w="255" w:type="dxa"/>
+            <w:tcW w:w="254" w:type="dxa"/>
             <w:tcBorders/>
           </w:tcPr>
           <w:p>
@@ -911,7 +911,7 @@
         </w:tc>
         <w:tc>
           <w:tcPr>
-            <w:tcW w:w="2551" w:type="dxa"/>
+            <w:tcW w:w="2552" w:type="dxa"/>
             <w:tcBorders/>
             <w:vAlign w:val="bottom"/>
           </w:tcPr>
@@ -938,7 +938,7 @@
         </w:trPr>
         <w:tc>
           <w:tcPr>
-            <w:tcW w:w="2631" w:type="dxa"/>
+            <w:tcW w:w="2630" w:type="dxa"/>
             <w:tcBorders/>
             <w:vAlign w:val="bottom"/>
           </w:tcPr>
@@ -985,7 +985,7 @@
         </w:tc>
         <w:tc>
           <w:tcPr>
-            <w:tcW w:w="2470" w:type="dxa"/>
+            <w:tcW w:w="2471" w:type="dxa"/>
             <w:tcBorders>
               <w:top w:val="single" w:sz="4" w:space="0" w:color="000000"/>
             </w:tcBorders>
@@ -1009,7 +1009,7 @@
         </w:tc>
         <w:tc>
           <w:tcPr>
-            <w:tcW w:w="255" w:type="dxa"/>
+            <w:tcW w:w="254" w:type="dxa"/>
             <w:tcBorders/>
           </w:tcPr>
           <w:p>
@@ -1031,7 +1031,7 @@
         </w:tc>
         <w:tc>
           <w:tcPr>
-            <w:tcW w:w="2551" w:type="dxa"/>
+            <w:tcW w:w="2552" w:type="dxa"/>
             <w:tcBorders/>
           </w:tcPr>
           <w:p>
@@ -1171,8 +1171,8 @@
         <w:tblLook w:noHBand="0" w:noVBand="1" w:firstColumn="1" w:lastRow="0" w:lastColumn="0" w:firstRow="1" w:val="04a0"/>
       </w:tblPr>
       <w:tblGrid>
-        <w:gridCol w:w="4044"/>
-        <w:gridCol w:w="2312"/>
+        <w:gridCol w:w="4043"/>
+        <w:gridCol w:w="2313"/>
         <w:gridCol w:w="2998"/>
       </w:tblGrid>
       <w:tr>
@@ -1432,7 +1432,7 @@
         </w:trPr>
         <w:tc>
           <w:tcPr>
-            <w:tcW w:w="4044" w:type="dxa"/>
+            <w:tcW w:w="4043" w:type="dxa"/>
             <w:tcBorders/>
             <w:vAlign w:val="bottom"/>
           </w:tcPr>
@@ -1454,7 +1454,7 @@
         </w:tc>
         <w:tc>
           <w:tcPr>
-            <w:tcW w:w="2312" w:type="dxa"/>
+            <w:tcW w:w="2313" w:type="dxa"/>
             <w:tcBorders>
               <w:bottom w:val="single" w:sz="4" w:space="0" w:color="000000"/>
             </w:tcBorders>
@@ -1545,7 +1545,7 @@
         </w:trPr>
         <w:tc>
           <w:tcPr>
-            <w:tcW w:w="4044" w:type="dxa"/>
+            <w:tcW w:w="4043" w:type="dxa"/>
             <w:tcBorders/>
             <w:vAlign w:val="bottom"/>
           </w:tcPr>
@@ -1566,7 +1566,7 @@
         </w:tc>
         <w:tc>
           <w:tcPr>
-            <w:tcW w:w="2312" w:type="dxa"/>
+            <w:tcW w:w="2313" w:type="dxa"/>
             <w:tcBorders>
               <w:top w:val="single" w:sz="4" w:space="0" w:color="000000"/>
               <w:bottom w:val="single" w:sz="4" w:space="0" w:color="000000"/>
@@ -1943,15 +1943,7 @@
       <w:bookmarkStart w:id="7" w:name="_Toc230206151"/>
       <w:r>
         <w:rPr/>
-        <w:t>2.</w:t>
-      </w:r>
-      <w:r>
-        <w:rPr/>
-        <w:t>1</w:t>
-      </w:r>
-      <w:r>
-        <w:rPr/>
-        <w:t xml:space="preserve">. </w:t>
+        <w:t xml:space="preserve">2.1. </w:t>
       </w:r>
       <w:bookmarkEnd w:id="7"/>
       <w:r>
@@ -2314,92 +2306,72 @@
     <w:p>
       <w:pPr>
         <w:pStyle w:val="Heading3"/>
+        <w:spacing w:before="0" w:after="0"/>
         <w:ind w:hanging="0" w:start="0"/>
         <w:rPr/>
       </w:pPr>
       <w:r>
         <w:rPr/>
-        <w:t xml:space="preserve">2.2. </w:t>
-      </w:r>
-      <w:r>
-        <w:rPr/>
-        <w:t>GUI</w:t>
-      </w:r>
-    </w:p>
-    <w:p>
-      <w:pPr>
-        <w:pStyle w:val="BodyText"/>
-        <w:rPr/>
-      </w:pPr>
-      <w:r>
-        <w:rPr>
-          <w:rFonts w:ascii="Times New Roman" w:hAnsi="Times New Roman"/>
-        </w:rPr>
+        <w:t>2.2. GUI</w:t>
+      </w:r>
+    </w:p>
+    <w:p>
+      <w:pPr>
+        <w:pStyle w:val="BodyText"/>
+        <w:rPr/>
+      </w:pPr>
+      <w:r>
+        <w:rPr/>
         <w:t xml:space="preserve">Графический интерфейс реализован с использованием библиотеки PySide6. Навигация между основными экранами осуществляется с помощью контейнера </w:t>
       </w:r>
       <w:r>
         <w:rPr>
           <w:rStyle w:val="SourceText"/>
-          <w:rFonts w:ascii="Times New Roman" w:hAnsi="Times New Roman"/>
         </w:rPr>
         <w:t>QStackedWidget</w:t>
       </w:r>
       <w:r>
-        <w:rPr>
-          <w:rFonts w:ascii="Times New Roman" w:hAnsi="Times New Roman"/>
-        </w:rPr>
+        <w:rPr/>
         <w:t xml:space="preserve">, а управление переходами выполняется из </w:t>
       </w:r>
       <w:r>
         <w:rPr>
           <w:rStyle w:val="SourceText"/>
-          <w:rFonts w:ascii="Times New Roman" w:hAnsi="Times New Roman"/>
         </w:rPr>
         <w:t>MainWindow</w:t>
       </w:r>
       <w:r>
-        <w:rPr>
-          <w:rFonts w:ascii="Times New Roman" w:hAnsi="Times New Roman"/>
-        </w:rPr>
+        <w:rPr/>
         <w:t xml:space="preserve">. Каждая страница и виджет представляют собой независимый класс-наследник </w:t>
       </w:r>
       <w:r>
         <w:rPr>
           <w:rStyle w:val="SourceText"/>
-          <w:rFonts w:ascii="Times New Roman" w:hAnsi="Times New Roman"/>
         </w:rPr>
         <w:t>QWidget</w:t>
       </w:r>
       <w:r>
-        <w:rPr>
-          <w:rFonts w:ascii="Times New Roman" w:hAnsi="Times New Roman"/>
-        </w:rPr>
+        <w:rPr/>
         <w:t>/</w:t>
       </w:r>
       <w:r>
         <w:rPr>
           <w:rStyle w:val="SourceText"/>
-          <w:rFonts w:ascii="Times New Roman" w:hAnsi="Times New Roman"/>
         </w:rPr>
         <w:t>QGroupBox</w:t>
       </w:r>
       <w:r>
-        <w:rPr>
-          <w:rFonts w:ascii="Times New Roman" w:hAnsi="Times New Roman"/>
-        </w:rPr>
+        <w:rPr/>
         <w:t>/</w:t>
       </w:r>
       <w:r>
         <w:rPr>
           <w:rStyle w:val="SourceText"/>
-          <w:rFonts w:ascii="Times New Roman" w:hAnsi="Times New Roman"/>
         </w:rPr>
         <w:t>QDialog</w:t>
       </w:r>
       <w:r>
-        <w:rPr>
-          <w:rFonts w:ascii="Times New Roman" w:hAnsi="Times New Roman"/>
-        </w:rPr>
+        <w:rPr/>
         <w:t>, взаимодействующий с остальной системой посредством механизма сигналов и слотов.</w:t>
       </w:r>
     </w:p>
@@ -2411,40 +2383,31 @@
       <w:r>
         <w:rPr>
           <w:rStyle w:val="Strong"/>
-          <w:rFonts w:ascii="Times New Roman" w:hAnsi="Times New Roman"/>
         </w:rPr>
         <w:t xml:space="preserve">WelcomePage — </w:t>
       </w:r>
       <w:r>
-        <w:rPr>
-          <w:rFonts w:ascii="Times New Roman" w:hAnsi="Times New Roman"/>
-        </w:rPr>
+        <w:rPr/>
         <w:t>стартовая страница приложения. Отображает краткое описание назначения программы и предоставляет пользователю возможность перейти к дашборду (</w:t>
       </w:r>
       <w:r>
         <w:rPr>
           <w:rStyle w:val="SourceText"/>
-          <w:rFonts w:ascii="Times New Roman" w:hAnsi="Times New Roman"/>
         </w:rPr>
         <w:t>next_clicked</w:t>
       </w:r>
       <w:r>
-        <w:rPr>
-          <w:rFonts w:ascii="Times New Roman" w:hAnsi="Times New Roman"/>
-        </w:rPr>
+        <w:rPr/>
         <w:t>) или завершить работу приложения (</w:t>
       </w:r>
       <w:r>
         <w:rPr>
           <w:rStyle w:val="SourceText"/>
-          <w:rFonts w:ascii="Times New Roman" w:hAnsi="Times New Roman"/>
         </w:rPr>
         <w:t>quit_clicked</w:t>
       </w:r>
       <w:r>
-        <w:rPr>
-          <w:rFonts w:ascii="Times New Roman" w:hAnsi="Times New Roman"/>
-        </w:rPr>
+        <w:rPr/>
         <w:t>).</w:t>
       </w:r>
     </w:p>
@@ -2456,142 +2419,31 @@
       <w:r>
         <w:rPr>
           <w:rStyle w:val="Strong"/>
-          <w:rFonts w:ascii="Times New Roman" w:hAnsi="Times New Roman"/>
         </w:rPr>
         <w:t xml:space="preserve">DashboardPage — </w:t>
       </w:r>
       <w:r>
-        <w:rPr>
-          <w:rFonts w:ascii="Times New Roman" w:hAnsi="Times New Roman"/>
-        </w:rPr>
-        <w:t xml:space="preserve">главная </w:t>
-      </w:r>
-      <w:r>
-        <w:rPr>
-          <w:rFonts w:ascii="Times New Roman" w:hAnsi="Times New Roman"/>
-        </w:rPr>
-        <w:t xml:space="preserve">страница приложения, </w:t>
-      </w:r>
-      <w:r>
-        <w:rPr>
-          <w:rFonts w:ascii="Times New Roman" w:hAnsi="Times New Roman"/>
-        </w:rPr>
-        <w:t xml:space="preserve">в которой осуществляется </w:t>
-      </w:r>
-      <w:r>
-        <w:rPr>
-          <w:rFonts w:ascii="Times New Roman" w:hAnsi="Times New Roman"/>
-        </w:rPr>
-        <w:t>ввод данных, настройк</w:t>
-      </w:r>
-      <w:r>
-        <w:rPr>
-          <w:rFonts w:ascii="Times New Roman" w:hAnsi="Times New Roman"/>
-        </w:rPr>
-        <w:t>а</w:t>
-      </w:r>
-      <w:r>
-        <w:rPr>
-          <w:rFonts w:ascii="Times New Roman" w:hAnsi="Times New Roman"/>
-        </w:rPr>
-        <w:t xml:space="preserve"> параметров алгоритма и отображение результатов. </w:t>
-      </w:r>
-      <w:r>
-        <w:rPr>
-          <w:rFonts w:ascii="Times New Roman" w:hAnsi="Times New Roman"/>
-        </w:rPr>
-        <w:t>На</w:t>
-      </w:r>
-      <w:r>
-        <w:rPr>
-          <w:rFonts w:ascii="Times New Roman" w:hAnsi="Times New Roman"/>
-        </w:rPr>
-        <w:t xml:space="preserve"> левую панель </w:t>
-      </w:r>
-      <w:r>
-        <w:rPr>
-          <w:rFonts w:ascii="Times New Roman" w:hAnsi="Times New Roman"/>
-        </w:rPr>
-        <w:t xml:space="preserve">вынесены </w:t>
-      </w:r>
-      <w:r>
-        <w:rPr>
-          <w:rFonts w:ascii="Times New Roman" w:hAnsi="Times New Roman"/>
-        </w:rPr>
-        <w:t xml:space="preserve">источник данных, параметры </w:t>
-      </w:r>
-      <w:r>
-        <w:rPr>
-          <w:rFonts w:ascii="Times New Roman" w:hAnsi="Times New Roman"/>
-        </w:rPr>
-        <w:t>генетического алгоритма и</w:t>
-      </w:r>
-      <w:r>
-        <w:rPr>
-          <w:rFonts w:ascii="Times New Roman" w:hAnsi="Times New Roman"/>
-        </w:rPr>
-        <w:t xml:space="preserve"> кнопки управления</w:t>
-      </w:r>
-      <w:r>
-        <w:rPr>
-          <w:rFonts w:ascii="Times New Roman" w:hAnsi="Times New Roman"/>
-        </w:rPr>
-        <w:t>,</w:t>
-      </w:r>
-      <w:r>
-        <w:rPr>
-          <w:rFonts w:ascii="Times New Roman" w:hAnsi="Times New Roman"/>
-        </w:rPr>
-        <w:t xml:space="preserve"> </w:t>
-      </w:r>
-      <w:r>
-        <w:rPr>
-          <w:rFonts w:ascii="Times New Roman" w:hAnsi="Times New Roman"/>
-        </w:rPr>
-        <w:t>на</w:t>
-      </w:r>
-      <w:r>
-        <w:rPr>
-          <w:rFonts w:ascii="Times New Roman" w:hAnsi="Times New Roman"/>
-        </w:rPr>
-        <w:t xml:space="preserve"> правую панель — график сходимости и результат</w:t>
-      </w:r>
-      <w:r>
-        <w:rPr>
-          <w:rFonts w:ascii="Times New Roman" w:hAnsi="Times New Roman"/>
-        </w:rPr>
-        <w:t>ы текущего шага алгоритма</w:t>
-      </w:r>
-      <w:r>
-        <w:rPr>
-          <w:rFonts w:ascii="Times New Roman" w:hAnsi="Times New Roman"/>
-        </w:rPr>
-        <w:t>. Содержит кнопки «Запустить алгоритм» и «Значения по умолчанию»; по нажатию первой собирает матрицы и параметры, проверяет их валидность (</w:t>
+        <w:rPr/>
+        <w:t>главная страница приложения, в которой осуществляется ввод данных, настройка параметров алгоритма и отображение результатов. На левую панель вынесены источник данных, параметры генетического алгоритма и кнопки управления, на правую панель — график сходимости и результаты текущего шага алгоритма. Содержит кнопки «Запустить алгоритм» и «Значения по умолчанию»; по нажатию первой собирает матрицы и параметры, проверяет их валидность (</w:t>
       </w:r>
       <w:r>
         <w:rPr>
           <w:rStyle w:val="SourceText"/>
-          <w:rFonts w:ascii="Times New Roman" w:hAnsi="Times New Roman"/>
         </w:rPr>
         <w:t>_validate_input</w:t>
       </w:r>
       <w:r>
-        <w:rPr>
-          <w:rFonts w:ascii="Times New Roman" w:hAnsi="Times New Roman"/>
-        </w:rPr>
+        <w:rPr/>
         <w:t xml:space="preserve">) и запускает расчёт через </w:t>
       </w:r>
       <w:r>
         <w:rPr>
           <w:rStyle w:val="SourceText"/>
-          <w:rFonts w:ascii="Times New Roman" w:hAnsi="Times New Roman"/>
         </w:rPr>
         <w:t>get_plot_data</w:t>
       </w:r>
       <w:r>
-        <w:rPr>
-          <w:rFonts w:ascii="Times New Roman" w:hAnsi="Times New Roman"/>
-        </w:rPr>
+        <w:rPr/>
         <w:t>, после чего обновляет график и результаты.</w:t>
       </w:r>
     </w:p>
@@ -2603,27 +2455,12 @@
       <w:r>
         <w:rPr>
           <w:rStyle w:val="Strong"/>
-          <w:rFonts w:ascii="Times New Roman" w:hAnsi="Times New Roman"/>
         </w:rPr>
         <w:t xml:space="preserve">ChoiceBoard </w:t>
       </w:r>
       <w:r>
-        <w:rPr>
-          <w:rFonts w:ascii="Times New Roman" w:hAnsi="Times New Roman"/>
-        </w:rPr>
-        <w:t xml:space="preserve">— виджет выбора способа </w:t>
-      </w:r>
-      <w:r>
-        <w:rPr>
-          <w:rFonts w:ascii="Times New Roman" w:hAnsi="Times New Roman"/>
-        </w:rPr>
-        <w:t xml:space="preserve">ввода </w:t>
-      </w:r>
-      <w:r>
-        <w:rPr>
-          <w:rFonts w:ascii="Times New Roman" w:hAnsi="Times New Roman"/>
-        </w:rPr>
-        <w:t>матриц. Пользователь может выбрать один из трёх режимов, переключаемых кнопками:</w:t>
+        <w:rPr/>
+        <w:t>— виджет выбора способа ввода матриц. Пользователь может выбрать один из трёх режимов, переключаемых кнопками:</w:t>
       </w:r>
     </w:p>
     <w:p>
@@ -2637,7 +2474,7 @@
           <w:tab w:val="clear" w:pos="709"/>
           <w:tab w:val="left" w:pos="0" w:leader="none"/>
         </w:tabs>
-        <w:ind w:firstLine="426" w:start="709"/>
+        <w:ind w:firstLine="426"/>
         <w:rPr/>
       </w:pPr>
       <w:r>
@@ -2656,26 +2493,21 @@
           <w:tab w:val="clear" w:pos="709"/>
           <w:tab w:val="left" w:pos="0" w:leader="none"/>
         </w:tabs>
-        <w:ind w:firstLine="426" w:start="709"/>
-        <w:rPr/>
-      </w:pPr>
-      <w:r>
-        <w:rPr>
-          <w:rFonts w:ascii="Times New Roman" w:hAnsi="Times New Roman"/>
-        </w:rPr>
+        <w:ind w:firstLine="426"/>
+        <w:rPr/>
+      </w:pPr>
+      <w:r>
+        <w:rPr/>
         <w:t xml:space="preserve">загрузка данных из текстового файла через </w:t>
       </w:r>
       <w:r>
         <w:rPr>
           <w:rStyle w:val="SourceText"/>
-          <w:rFonts w:ascii="Times New Roman" w:hAnsi="Times New Roman"/>
         </w:rPr>
         <w:t>QFileDialog</w:t>
       </w:r>
       <w:r>
-        <w:rPr>
-          <w:rFonts w:ascii="Times New Roman" w:hAnsi="Times New Roman"/>
-        </w:rPr>
+        <w:rPr/>
         <w:t xml:space="preserve">; </w:t>
       </w:r>
     </w:p>
@@ -2690,78 +2522,126 @@
           <w:tab w:val="clear" w:pos="709"/>
           <w:tab w:val="left" w:pos="0" w:leader="none"/>
         </w:tabs>
-        <w:ind w:firstLine="426" w:start="709"/>
-        <w:rPr/>
-      </w:pPr>
-      <w:r>
+        <w:ind w:firstLine="426"/>
+        <w:rPr/>
+      </w:pPr>
+      <w:r>
+        <w:rPr/>
+        <w:t xml:space="preserve">ручной ввод размеров матриц через диалоговое окно </w:t>
+      </w:r>
+      <w:r>
+        <w:rPr>
+          <w:rStyle w:val="SourceText"/>
+        </w:rPr>
+        <w:t>ManualInputDialog</w:t>
+      </w:r>
+      <w:r>
+        <w:rPr/>
+        <w:t>.</w:t>
+      </w:r>
+    </w:p>
+    <w:p>
+      <w:pPr>
+        <w:pStyle w:val="BodyText"/>
+        <w:rPr/>
+      </w:pPr>
+      <w:r>
+        <w:rPr/>
+        <w:t>При смене источника интерфейс перестраивается (</w:t>
+      </w:r>
+      <w:r>
+        <w:rPr>
+          <w:rStyle w:val="SourceText"/>
+        </w:rPr>
+        <w:t>_on_source_changed</w:t>
+      </w:r>
+      <w:r>
+        <w:rPr/>
+        <w:t xml:space="preserve">): активными становятся только элементы управления, относящиеся к выбранному режиму, а список ранее полученных матриц и статус сбрасываются. Список сформированных матриц отображается в </w:t>
+      </w:r>
+      <w:r>
+        <w:rPr>
+          <w:rStyle w:val="SourceText"/>
+        </w:rPr>
+        <w:t>QListWidget</w:t>
+      </w:r>
+      <w:r>
+        <w:rPr/>
+        <w:t xml:space="preserve">, а статус операции (успех/ошибка) — в текстовой метке с цветовой индикацией. При изменении набора матриц испускается сигнал </w:t>
+      </w:r>
+      <w:r>
+        <w:rPr>
+          <w:rStyle w:val="SourceText"/>
+        </w:rPr>
+        <w:t>matrices_changed</w:t>
+      </w:r>
+      <w:r>
+        <w:rPr/>
+        <w:t>.</w:t>
+      </w:r>
+    </w:p>
+    <w:p>
+      <w:pPr>
+        <w:pStyle w:val="BodyText"/>
+        <w:rPr/>
+      </w:pPr>
+      <w:r>
+        <w:rPr>
+          <w:rStyle w:val="Strong"/>
+        </w:rPr>
+        <w:t xml:space="preserve">ManualInputDialog — </w:t>
+      </w:r>
+      <w:r>
+        <w:rPr/>
+        <w:t>диалог ручного ввода цепочки матриц. Позволяет последовательно добавлять размеры (высоту и ширину) очередной матрицы и автоматически проверяет совместимость цепочки на каждом шаге (совпадение соседних размерностей). Предусмотрена возможность удаления последней добавленной матрицы. Кнопка подтверждения («Готово») становится доступна только после добавления не менее двух совместимых матриц; статус-метка подсказывает пользователю текущее состояние («Добавьте матрицы», «Можно считать», «Данные матрицы невозможно перемножить» и т.д.).</w:t>
+      </w:r>
+    </w:p>
+    <w:p>
+      <w:pPr>
+        <w:pStyle w:val="BodyText"/>
+        <w:rPr/>
+      </w:pPr>
+      <w:r>
+        <w:rPr>
+          <w:rStyle w:val="Strong"/>
+        </w:rPr>
+        <w:t>GAParamsPanel</w:t>
+      </w:r>
+      <w:r>
+        <w:rPr/>
+        <w:t xml:space="preserve"> — панель настройки параметров генетического алгоритма: размер популяции, число поколений, вероятность мутации и вероятность скрещивания. Каждый параметр снабжён подсказкой (</w:t>
+      </w:r>
+      <w:r>
+        <w:rPr>
+          <w:rStyle w:val="SourceText"/>
+        </w:rPr>
+        <w:t>HintLabel</w:t>
+      </w:r>
+      <w:r>
+        <w:rPr/>
+        <w:t>) с всплывающей информацией об его влиянии на работу алгоритма. Предусмотрена кнопка сброса к значениям по умолчанию.</w:t>
+      </w:r>
+    </w:p>
+    <w:p>
+      <w:pPr>
+        <w:pStyle w:val="BodyText"/>
         <w:rPr>
           <w:rFonts w:ascii="Times New Roman" w:hAnsi="Times New Roman"/>
         </w:rPr>
-        <w:t xml:space="preserve">ручной ввод размеров матриц через диалоговое окно </w:t>
+      </w:pPr>
+      <w:r>
+        <w:rPr/>
+        <w:t xml:space="preserve">Справа с помощью </w:t>
       </w:r>
       <w:r>
         <w:rPr>
           <w:rStyle w:val="SourceText"/>
-          <w:rFonts w:ascii="Times New Roman" w:hAnsi="Times New Roman"/>
-        </w:rPr>
-        <w:t>ManualInputDialog</w:t>
-      </w:r>
-      <w:r>
-        <w:rPr>
-          <w:rFonts w:ascii="Times New Roman" w:hAnsi="Times New Roman"/>
-        </w:rPr>
-        <w:t>.</w:t>
-      </w:r>
-    </w:p>
-    <w:p>
-      <w:pPr>
-        <w:pStyle w:val="BodyText"/>
-        <w:rPr/>
-      </w:pPr>
-      <w:r>
-        <w:rPr>
-          <w:rFonts w:ascii="Times New Roman" w:hAnsi="Times New Roman"/>
-        </w:rPr>
-        <w:t>При смене источника интерфейс перестраивается (</w:t>
-      </w:r>
-      <w:r>
-        <w:rPr>
-          <w:rStyle w:val="SourceText"/>
-          <w:rFonts w:ascii="Times New Roman" w:hAnsi="Times New Roman"/>
-        </w:rPr>
-        <w:t>_on_source_changed</w:t>
-      </w:r>
-      <w:r>
-        <w:rPr>
-          <w:rFonts w:ascii="Times New Roman" w:hAnsi="Times New Roman"/>
-        </w:rPr>
-        <w:t xml:space="preserve">): активными становятся только элементы управления, относящиеся к выбранному режиму, а список ранее полученных матриц и статус сбрасываются. Список сформированных матриц отображается в </w:t>
-      </w:r>
-      <w:r>
-        <w:rPr>
-          <w:rStyle w:val="SourceText"/>
-          <w:rFonts w:ascii="Times New Roman" w:hAnsi="Times New Roman"/>
-        </w:rPr>
-        <w:t>QListWidget</w:t>
-      </w:r>
-      <w:r>
-        <w:rPr>
-          <w:rFonts w:ascii="Times New Roman" w:hAnsi="Times New Roman"/>
-        </w:rPr>
-        <w:t xml:space="preserve">, а статус операции (успех/ошибка) — в текстовой метке с цветовой индикацией. При изменении набора матриц испускается сигнал </w:t>
-      </w:r>
-      <w:r>
-        <w:rPr>
-          <w:rStyle w:val="SourceText"/>
-          <w:rFonts w:ascii="Times New Roman" w:hAnsi="Times New Roman"/>
-        </w:rPr>
-        <w:t>matrices_changed</w:t>
-      </w:r>
-      <w:r>
-        <w:rPr>
-          <w:rFonts w:ascii="Times New Roman" w:hAnsi="Times New Roman"/>
-        </w:rPr>
-        <w:t>.</w:t>
+        </w:rPr>
+        <w:t xml:space="preserve">pyqtgraph </w:t>
+      </w:r>
+      <w:r>
+        <w:rPr/>
+        <w:t>рисуется график динамики сходимости алгоритма с тремя кривыми: динамика лучшего значения поколения, динамика среднего значения поколения и линия целевого отношения.</w:t>
       </w:r>
     </w:p>
     <w:p>
@@ -2772,15 +2652,12 @@
       <w:r>
         <w:rPr>
           <w:rStyle w:val="Strong"/>
-          <w:rFonts w:ascii="Times New Roman" w:hAnsi="Times New Roman"/>
-        </w:rPr>
-        <w:t xml:space="preserve">ManualInputDialog — </w:t>
-      </w:r>
-      <w:r>
-        <w:rPr>
-          <w:rFonts w:ascii="Times New Roman" w:hAnsi="Times New Roman"/>
-        </w:rPr>
-        <w:t>диалог ручного ввода цепочки матриц. Позволяет последовательно добавлять размеры (высоту и ширину) очередной матрицы и автоматически проверяет совместимость цепочки на каждом шаге (совпадение соседних размерностей). Предусмотрена возможность удаления последней добавленной матрицы. Кнопка подтверждения («Готово») становится доступна только после добавления не менее двух совместимых матриц; статус-метка подсказывает пользователю текущее состояние («Добавьте матрицы», «Можно считать», «Данные матрицы невозможно перемножить» и т.д.).</w:t>
+        </w:rPr>
+        <w:t xml:space="preserve">ResultsPanel </w:t>
+      </w:r>
+      <w:r>
+        <w:rPr/>
+        <w:t>— панель отображения итоговых результатов работы алгоритма: лучшая найденная стоимость, отношение к целевому значению, номер поколения, на котором достигнут лучший результат, и найденный порядок умножения матриц. До получения данных все поля отображают «-».</w:t>
       </w:r>
     </w:p>
     <w:p>
@@ -2791,147 +2668,12 @@
       <w:r>
         <w:rPr>
           <w:rStyle w:val="Strong"/>
-          <w:rFonts w:ascii="Times New Roman" w:hAnsi="Times New Roman"/>
-        </w:rPr>
-        <w:t>GAParamsPanel</w:t>
-      </w:r>
-      <w:r>
-        <w:rPr>
-          <w:rFonts w:ascii="Times New Roman" w:hAnsi="Times New Roman"/>
-        </w:rPr>
-        <w:t xml:space="preserve"> — панель настройки параметров генетического алгоритма: размер популяции, число поколений, вероятность мутации и вероятность скрещивания. Каждый параметр снабжён подсказкой (</w:t>
-      </w:r>
-      <w:r>
-        <w:rPr>
-          <w:rStyle w:val="SourceText"/>
-          <w:rFonts w:ascii="Times New Roman" w:hAnsi="Times New Roman"/>
-        </w:rPr>
-        <w:t>HintLabel</w:t>
-      </w:r>
-      <w:r>
-        <w:rPr>
-          <w:rFonts w:ascii="Times New Roman" w:hAnsi="Times New Roman"/>
-        </w:rPr>
-        <w:t>) с всплывающей информацией об его влиянии на работу алгоритма. Предусмотрена кнопка сброса к значениям по умолчанию.</w:t>
-      </w:r>
-    </w:p>
-    <w:p>
-      <w:pPr>
-        <w:pStyle w:val="BodyText"/>
-        <w:rPr>
-          <w:rFonts w:ascii="Times New Roman" w:hAnsi="Times New Roman"/>
-        </w:rPr>
-      </w:pPr>
-      <w:r>
-        <w:rPr>
-          <w:rFonts w:ascii="Times New Roman" w:hAnsi="Times New Roman"/>
-        </w:rPr>
-        <w:t xml:space="preserve">Справа с помощью </w:t>
-      </w:r>
-      <w:r>
-        <w:rPr>
-          <w:rStyle w:val="SourceText"/>
-          <w:rFonts w:ascii="Times New Roman" w:hAnsi="Times New Roman"/>
-        </w:rPr>
-        <w:t xml:space="preserve">pyqtgraph </w:t>
-      </w:r>
-      <w:r>
-        <w:rPr>
-          <w:rFonts w:ascii="Times New Roman" w:hAnsi="Times New Roman"/>
-        </w:rPr>
-        <w:t>рисуется</w:t>
-      </w:r>
-      <w:r>
-        <w:rPr>
-          <w:rFonts w:ascii="Times New Roman" w:hAnsi="Times New Roman"/>
-        </w:rPr>
-        <w:t xml:space="preserve"> график </w:t>
-      </w:r>
-      <w:r>
-        <w:rPr>
-          <w:rFonts w:ascii="Times New Roman" w:hAnsi="Times New Roman"/>
-        </w:rPr>
-        <w:t xml:space="preserve">динамики сходимости алгоритма с </w:t>
-      </w:r>
-      <w:r>
-        <w:rPr>
-          <w:rFonts w:ascii="Times New Roman" w:hAnsi="Times New Roman"/>
-        </w:rPr>
-        <w:t>тр</w:t>
-      </w:r>
-      <w:r>
-        <w:rPr>
-          <w:rFonts w:ascii="Times New Roman" w:hAnsi="Times New Roman"/>
-        </w:rPr>
-        <w:t>емя</w:t>
-      </w:r>
-      <w:r>
-        <w:rPr>
-          <w:rFonts w:ascii="Times New Roman" w:hAnsi="Times New Roman"/>
-        </w:rPr>
-        <w:t xml:space="preserve"> кривы</w:t>
-      </w:r>
-      <w:r>
-        <w:rPr>
-          <w:rFonts w:ascii="Times New Roman" w:hAnsi="Times New Roman"/>
-        </w:rPr>
-        <w:t>ми</w:t>
-      </w:r>
-      <w:r>
-        <w:rPr>
-          <w:rFonts w:ascii="Times New Roman" w:hAnsi="Times New Roman"/>
-        </w:rPr>
-        <w:t>: динамика лучшего значения поколения, динамика среднего значения поколения и линия целевого отношения.</w:t>
-      </w:r>
-    </w:p>
-    <w:p>
-      <w:pPr>
-        <w:pStyle w:val="BodyText"/>
-        <w:rPr/>
-      </w:pPr>
-      <w:r>
-        <w:rPr>
-          <w:rStyle w:val="Strong"/>
-          <w:rFonts w:ascii="Times New Roman" w:hAnsi="Times New Roman"/>
-        </w:rPr>
-        <w:t xml:space="preserve">ResultsPanel </w:t>
-      </w:r>
-      <w:r>
-        <w:rPr>
-          <w:rFonts w:ascii="Times New Roman" w:hAnsi="Times New Roman"/>
-        </w:rPr>
-        <w:t>— панель отображения итоговых результатов работы алгоритма: лучшая найденная стоимость, отношение к целевому значению, номер поколения, на котором достигнут лучший результат, и найденный порядок умножения матриц. До получения данных все поля отображают «</w:t>
-      </w:r>
-      <w:r>
-        <w:rPr>
-          <w:rFonts w:ascii="Times New Roman" w:hAnsi="Times New Roman"/>
-        </w:rPr>
-        <w:t>-»</w:t>
-      </w:r>
-      <w:r>
-        <w:rPr>
-          <w:rFonts w:ascii="Times New Roman" w:hAnsi="Times New Roman"/>
-        </w:rPr>
-        <w:t>.</w:t>
-      </w:r>
-    </w:p>
-    <w:p>
-      <w:pPr>
-        <w:pStyle w:val="BodyText"/>
-        <w:rPr/>
-      </w:pPr>
-      <w:r>
-        <w:rPr>
-          <w:rStyle w:val="Strong"/>
-          <w:rFonts w:ascii="Times New Roman" w:hAnsi="Times New Roman"/>
         </w:rPr>
         <w:t>MainWindow</w:t>
       </w:r>
       <w:r>
-        <w:rPr>
-          <w:rFonts w:ascii="Times New Roman" w:hAnsi="Times New Roman"/>
-        </w:rPr>
-        <w:t xml:space="preserve"> — главное окно приложения, объединяющее обе страницы в единый интерфейс.</w:t>
+        <w:rPr/>
+        <w:t xml:space="preserve"> — главное окно приложения.</w:t>
       </w:r>
     </w:p>
     <w:p>
@@ -2945,39 +2687,31 @@
           <w:tab w:val="clear" w:pos="709"/>
           <w:tab w:val="left" w:pos="0" w:leader="none"/>
         </w:tabs>
-        <w:ind w:firstLine="426" w:start="709"/>
-        <w:rPr/>
-      </w:pPr>
-      <w:r>
-        <w:rPr>
-          <w:rFonts w:ascii="Times New Roman" w:hAnsi="Times New Roman"/>
-        </w:rPr>
+        <w:ind w:firstLine="426"/>
+        <w:rPr/>
+      </w:pPr>
+      <w:r>
+        <w:rPr/>
         <w:t xml:space="preserve">создаёт экземпляры </w:t>
       </w:r>
       <w:r>
         <w:rPr>
           <w:rStyle w:val="SourceText"/>
-          <w:rFonts w:ascii="Times New Roman" w:hAnsi="Times New Roman"/>
         </w:rPr>
         <w:t>WelcomePage</w:t>
       </w:r>
       <w:r>
-        <w:rPr>
-          <w:rFonts w:ascii="Times New Roman" w:hAnsi="Times New Roman"/>
-        </w:rPr>
+        <w:rPr/>
         <w:t xml:space="preserve"> и </w:t>
       </w:r>
       <w:r>
         <w:rPr>
           <w:rStyle w:val="SourceText"/>
-          <w:rFonts w:ascii="Times New Roman" w:hAnsi="Times New Roman"/>
         </w:rPr>
         <w:t>DashboardPage</w:t>
       </w:r>
       <w:r>
-        <w:rPr>
-          <w:rFonts w:ascii="Times New Roman" w:hAnsi="Times New Roman"/>
-        </w:rPr>
+        <w:rPr/>
         <w:t xml:space="preserve">; </w:t>
       </w:r>
     </w:p>
@@ -2992,26 +2726,21 @@
           <w:tab w:val="clear" w:pos="709"/>
           <w:tab w:val="left" w:pos="0" w:leader="none"/>
         </w:tabs>
-        <w:ind w:firstLine="426" w:start="709"/>
-        <w:rPr/>
-      </w:pPr>
-      <w:r>
-        <w:rPr>
-          <w:rFonts w:ascii="Times New Roman" w:hAnsi="Times New Roman"/>
-        </w:rPr>
+        <w:ind w:firstLine="426"/>
+        <w:rPr/>
+      </w:pPr>
+      <w:r>
+        <w:rPr/>
         <w:t xml:space="preserve">размещает их в </w:t>
       </w:r>
       <w:r>
         <w:rPr>
           <w:rStyle w:val="SourceText"/>
-          <w:rFonts w:ascii="Times New Roman" w:hAnsi="Times New Roman"/>
         </w:rPr>
         <w:t>QStackedWidget</w:t>
       </w:r>
       <w:r>
-        <w:rPr>
-          <w:rFonts w:ascii="Times New Roman" w:hAnsi="Times New Roman"/>
-        </w:rPr>
+        <w:rPr/>
         <w:t xml:space="preserve">; </w:t>
       </w:r>
     </w:p>
@@ -3026,39 +2755,31 @@
           <w:tab w:val="clear" w:pos="709"/>
           <w:tab w:val="left" w:pos="0" w:leader="none"/>
         </w:tabs>
-        <w:ind w:firstLine="426" w:start="709"/>
-        <w:rPr/>
-      </w:pPr>
-      <w:r>
-        <w:rPr>
-          <w:rFonts w:ascii="Times New Roman" w:hAnsi="Times New Roman"/>
-        </w:rPr>
+        <w:ind w:firstLine="426"/>
+        <w:rPr/>
+      </w:pPr>
+      <w:r>
+        <w:rPr/>
         <w:t>обрабатывает сигналы навигации (</w:t>
       </w:r>
       <w:r>
         <w:rPr>
           <w:rStyle w:val="SourceText"/>
-          <w:rFonts w:ascii="Times New Roman" w:hAnsi="Times New Roman"/>
         </w:rPr>
         <w:t>next_clicked</w:t>
       </w:r>
       <w:r>
-        <w:rPr>
-          <w:rFonts w:ascii="Times New Roman" w:hAnsi="Times New Roman"/>
-        </w:rPr>
+        <w:rPr/>
         <w:t xml:space="preserve">, </w:t>
       </w:r>
       <w:r>
         <w:rPr>
           <w:rStyle w:val="SourceText"/>
-          <w:rFonts w:ascii="Times New Roman" w:hAnsi="Times New Roman"/>
         </w:rPr>
         <w:t>quit_clicked</w:t>
       </w:r>
       <w:r>
-        <w:rPr>
-          <w:rFonts w:ascii="Times New Roman" w:hAnsi="Times New Roman"/>
-        </w:rPr>
+        <w:rPr/>
         <w:t xml:space="preserve">), определяя переход между приветственной страницей и дашбордом; </w:t>
       </w:r>
     </w:p>
@@ -3073,34 +2794,12 @@
           <w:tab w:val="clear" w:pos="709"/>
           <w:tab w:val="left" w:pos="0" w:leader="none"/>
         </w:tabs>
-        <w:ind w:firstLine="426" w:start="709"/>
+        <w:ind w:firstLine="426"/>
         <w:rPr/>
       </w:pPr>
       <w:r>
         <w:rPr/>
         <w:t>устанавливает стартовую страницу и общие параметры окна (заголовок, размер).</w:t>
-      </w:r>
-    </w:p>
-    <w:p>
-      <w:pPr>
-        <w:pStyle w:val="BodyText"/>
-        <w:rPr/>
-      </w:pPr>
-      <w:r>
-        <w:rPr/>
-      </w:r>
-    </w:p>
-    <w:p>
-      <w:pPr>
-        <w:pStyle w:val="Heading3"/>
-        <w:numPr>
-          <w:ilvl w:val="2"/>
-          <w:numId w:val="2"/>
-        </w:numPr>
-        <w:rPr/>
-      </w:pPr>
-      <w:r>
-        <w:rPr/>
       </w:r>
       <w:bookmarkEnd w:id="8"/>
       <w:r>
@@ -3478,12 +3177,6 @@
         </w:rPr>
         <w:t xml:space="preserve"> </w:t>
         <w:br/>
-      </w:r>
-      <w:r>
-        <w:rPr>
-          <w:rFonts w:cs="Times New Roman"/>
-          <w:color w:val="000000"/>
-        </w:rPr>
         <w:t>Диаграмма классов</w:t>
       </w:r>
     </w:p>
@@ -3545,19 +3238,7 @@
       </w:pPr>
       <w:r>
         <w:rPr/>
-        <w:t xml:space="preserve">Рисунок </w:t>
-      </w:r>
-      <w:r>
-        <w:rPr/>
-        <w:t>1</w:t>
-      </w:r>
-      <w:r>
-        <w:rPr/>
-        <w:t xml:space="preserve"> — </w:t>
-      </w:r>
-      <w:r>
-        <w:rPr/>
-        <w:t>Диаграмма классов связки GUI и backend</w:t>
+        <w:t>Рисунок 1 — Диаграмма классов связки GUI и backend</w:t>
       </w:r>
     </w:p>
     <w:p>
@@ -3623,19 +3304,7 @@
       </w:pPr>
       <w:r>
         <w:rPr/>
-        <w:t xml:space="preserve">Рисунок </w:t>
-      </w:r>
-      <w:r>
-        <w:rPr/>
-        <w:t>2</w:t>
-      </w:r>
-      <w:r>
-        <w:rPr/>
-        <w:t xml:space="preserve"> — </w:t>
-      </w:r>
-      <w:r>
-        <w:rPr/>
-        <w:t>Диаграмма классов backend</w:t>
+        <w:t>Рисунок 2 — Диаграмма классов backend</w:t>
       </w:r>
     </w:p>
     <w:sectPr>
@@ -5637,8 +5306,8 @@
       <w:rFonts w:ascii="Liberation Mono" w:hAnsi="Liberation Mono" w:eastAsia="Noto Sans Mono CJK SC" w:cs="Liberation Mono"/>
     </w:rPr>
   </w:style>
-  <w:style w:type="character" w:styleId="Bulletsuser">
-    <w:name w:val="Bullets (user)"/>
+  <w:style w:type="character" w:styleId="Bullets">
+    <w:name w:val="Bullets"/>
     <w:qFormat/>
     <w:rPr>
       <w:rFonts w:ascii="OpenSymbol" w:hAnsi="OpenSymbol" w:eastAsia="OpenSymbol" w:cs="OpenSymbol"/>
@@ -5649,8 +5318,8 @@
     <w:qFormat/>
     <w:rPr/>
   </w:style>
-  <w:style w:type="character" w:styleId="Bullets">
-    <w:name w:val="Bullets"/>
+  <w:style w:type="character" w:styleId="Bulletsuser">
+    <w:name w:val="Bullets (user)"/>
     <w:qFormat/>
     <w:rPr>
       <w:rFonts w:ascii="OpenSymbol" w:hAnsi="OpenSymbol" w:eastAsia="OpenSymbol" w:cs="OpenSymbol"/>

</xml_diff>